<commit_message>
paper updates - divided work
</commit_message>
<xml_diff>
--- a/site/index_nature_submission.docx
+++ b/site/index_nature_submission.docx
@@ -68,11 +68,13 @@
         <w:pStyle w:val="Heading1"/>
       </w:pPr>
       <w:bookmarkStart w:id="1" w:name="_Ref237519268"/>
+      <w:bookmarkStart w:id="2" w:name="OLE_LINK2"/>
       <w:r>
         <w:t>Abstract</w:t>
       </w:r>
       <w:bookmarkEnd w:id="1"/>
     </w:p>
+    <w:bookmarkEnd w:id="2"/>
     <w:p>
       <w:r>
         <w:t>Distributed energy resources are central to decarbonization, resilience and electrification, but their benefits are not guaranteed to be shared evenly. Evidence of racial disparity in rooftop solar is usually assumed to generalize across technologies. We test that assumption across 1,390 California ZIP Code Tabulation Areas, harmonizing rooftop photovoltaics, battery storage and electric-vehicle charging under one set of outcomes and controls. The technologies do not share a disparity pattern. Areas with larger Black and Asian population shares hold less solar and less storage after conditioning on income and poverty, and area-level housing type and tenure absorb 32 to 53 percent of those gaps. Under a fully stacked specification, storage disparities persist on all three race terms, solar only for Asian share, and charging not at all. Charger counts instead rise with poverty, concentrated in faster public units. Counts measure infrastructure, not usable access, so technology-blind equity targets misread all three.</w:t>
@@ -80,60 +82,34 @@
     </w:p>
     <w:p>
       <w:r>
-        <w:t xml:space="preserve">As electricity systems decarbonize, distributed energy resources (DERs) are becoming central to emissions reduction, local resilience and electrification. Policy debate treats them as a single category, but the benefits they deliver are heterogeneous. Rooftop photovoltaics (PV) reduce bills for the household that hosts them. Battery storage delivers backup power and outage protection, which matter most where wildfire shutoffs and grid stress are common. Charging infrastructure determines who can participate in transportation electrification, and only if it sits where people </w:t>
-      </w:r>
-      <w:proofErr w:type="gramStart"/>
-      <w:r>
-        <w:t>actually live</w:t>
-      </w:r>
-      <w:proofErr w:type="gramEnd"/>
-      <w:r>
-        <w:t xml:space="preserve"> and park. The clean energy transition is therefore not only a deployment problem but a distributional one: where access depends on financing, housing conditions, siting decisions, permitting, interconnection or neighborhood infrastructure, the transition can reproduce existing inequities rather than reduce them.</w:t>
+        <w:t>As electricity systems decarbonize, distributed energy resources (DERs) are becoming central to emissions reduction, local resilience and electrification. Policy debate treats them as a single category, but the benefits they deliver are heterogeneous. Rooftop photovoltaics (PV) reduce bills for the household that hosts them. Battery storage delivers backup power and outage protection, which matter most where wildfire shutoffs and grid stress are common. Charging infrastructure determines who can participate in transportation electrification, and only if it sits where people actually live and park. The clean energy transition is therefore not only a deployment problem but a distributional one: where access depends on financing, housing conditions, siting decisions, permitting, interconnection or neighborhood infrastructure, the transition can reproduce existing inequities rather than reduce them.</w:t>
       </w:r>
     </w:p>
     <w:p>
       <w:r>
-        <w:t xml:space="preserve">The evidence that it does so is almost entirely about solar. Lukanov and Krieger show that California PV deployment is patterned by neighborhood socioeconomic conditions [1], and Sunter, Castellanos and </w:t>
-      </w:r>
-      <w:proofErr w:type="spellStart"/>
-      <w:r>
-        <w:t>Kammen</w:t>
-      </w:r>
-      <w:proofErr w:type="spellEnd"/>
-      <w:r>
-        <w:t xml:space="preserve"> show that racial and ethnic disparities in rooftop PV persist after accounting for income [2]. </w:t>
-      </w:r>
-      <w:proofErr w:type="spellStart"/>
-      <w:r>
-        <w:t>Kurdgelashvili</w:t>
-      </w:r>
-      <w:proofErr w:type="spellEnd"/>
-      <w:r>
-        <w:t xml:space="preserve"> and colleagues model county-level adoption in the same state [3], while Reames and </w:t>
-      </w:r>
-      <w:proofErr w:type="spellStart"/>
-      <w:r>
-        <w:t>Darghouth</w:t>
-      </w:r>
-      <w:proofErr w:type="spellEnd"/>
-      <w:r>
-        <w:t xml:space="preserve"> et al. document uneven rooftop access across communities and Sigrist et al. argue that inequitable siting reduces the carbon value of residential solar [4], [5], [6]. A parallel literature explains why race should be modeled explicitly rather than assumed away: race-linked inequities in energy burden persist net of income [7], transition planning cannot be treated as race-neutral when the underlying burdens are not [8], and structural barriers limit participation in California's DER programs even where they are designed for low-income households [9]. Because rooftop solar measurably reduces energy burden for low- and moderate-income adopters [10], unequal access to DERs also means unequal access to bill relief and resilience.</w:t>
+        <w:t>The evidence that it does so is almost entirely about solar. Lukanov and Krieger show that California PV deployment is patterned by neighborhood socioeconomic conditions [1], and Sunter, Castellanos and Kammen show that racial and ethnic disparities in rooftop PV persist after accounting for income [2]. Kurdgelashvili and colleagues model county-level adoption in the same state [3], while Reames and Darghouth et al. document uneven rooftop access across communities and Sigrist et al. argue that inequitable siting reduces the carbon value of residential solar [4][5][6]. A parallel literature explains why race should be modeled explicitly rather than assumed away: race-linked inequities in energy burden persist net of income [7], transition planning cannot be treated as race-neutral when the underlying burdens are not [8], and structural barriers limit participation in California's DER programs even where they are designed for low-income households [9]. Because rooftop solar measurably reduces energy burden for low- and moderate-income adopters [10], unequal access to DERs also means unequal access to bill relief and resilience.</w:t>
       </w:r>
     </w:p>
     <w:p>
       <w:r>
         <w:lastRenderedPageBreak/>
-        <w:t>What this literature does not establish is whether inequity in DER adoption is a solar-specific phenomenon or a general feature of the transition. The distinction matters because the barriers differ. Rooftop PV depends on roof control, housing tenure, financing and installer availability. Storage overlaps with PV but adds stronger dependence on upfront capital, resilience value and program design; it has been framed as an equity asset that can either broaden resilience or entrench advantage depending on ownership [14], [15]. Charging depends far more on siting, commercial activity and host context. Adoption is also gated by the grid itself: hosting-capacity constraints in California are socially patterned and limit deployment in disadvantaged communities [11], a problem that fairness-aware allocation schemes are only beginning to address [12], and that interconnection roadmaps identify as a national bottleneck [13]. A community adopting solar at the state average may still lack the storage that protects it during an outage, or the charging that lets its residents switch vehicles. Collapsing all three into one undifferentiated measure of “DER access” can hide exactly these offsetting patterns.</w:t>
+        <w:t>What this literature does not establish is whether inequity in DER adoption is a solar-specific phenomenon or a general feature of the transition. The distinction matters because the barriers differ. Rooftop PV depends on roof control, housing tenure, financing and installer availability. Storage overlaps with PV but adds stronger dependence on upfront capital, resilience value and program design; it has been framed as an equity asset that can either broaden resilience or entrench advantage depending on ownership [14][15]. Charging depends far more on siting, commercial activity and host context. Adoption is also gated by the grid itself: hosting-capacity constraints in California are socially patterned and limit deployment in disadvantaged communities [11], a problem that fairness-aware allocation schemes are only beginning to address [12], and that interconnection roadmaps identify as a national bottleneck [13]. A community adopting solar at the state average may still lack the storage that protects it during an outage, or the charging that lets its residents switch vehicles. Collapsing all three into one undifferentiated measure of “DER access” can hide exactly these offsetting patterns.</w:t>
       </w:r>
     </w:p>
     <w:p>
       <w:r>
-        <w:t>Three gaps follow. First, the evidence base for racial disparity net of income is solar-only, so we do not know whether inequity is a property of solar adoption or of the transition. Second, work that looks beyond PV treats each technology in isolation, under different data, geographies and specifications, which prevents direct comparison. Third, no harmonized, race-inclusive, multi-technology dataset exists at fine spatial granularity for a single high-penetration market, because DER data is fragmented across technologies and agencies [16], [17].</w:t>
+        <w:t>Three gaps follow. First, the evidence base for racial disparity net of income is solar-only, so we do not know whether inequity is a property of solar adoption or of the transition. Second, work that looks beyond PV treats each technology in isolation, under different data, geographies and specifications, which prevents direct comparison. Third, no harmonized, race-inclusive, multi-technology dataset exists at fine spatial granularity for a single high-penetration market, because DER data is fragmented across technologies and agencies [16][17].</w:t>
       </w:r>
     </w:p>
     <w:p>
       <w:r>
-        <w:t>This paper addresses all three. We assemble a California ZIP Code Tabulation Area (ZCTA) dataset integrating rooftop PV, battery storage and EV charging with American Community Survey demographics, climate and resource data, utility territory and electricity demand, and estimate one consistent set of specifications across all three, retaining race in every model rather than assuming socioeconomic controls absorb it. California is an informative case because it combines high DER penetration, ambitious climate policy, substantial socioeconomic diversity and pronounced spatial inequality. The study is area-level and cross-sectional; we report conditional associations, not causal effects. The central finding is that the form of inequity changes by technology, and that for charging the standard metric — the count of installed units — does not measure what equity policy assumes it measures.</w:t>
+        <w:t>This paper addresses all three. We assemble a California ZIP Code Tabulation Area (ZCTA) dataset integrating rooftop PV, battery storage and EV charging with American Community Survey demographics, climate and resource data, utility territory and electricity demand, and estimate one consistent set of specifications across all three, retaining race in every model rather than assuming socioeconomic controls absorb it. California is an informative case because it combines high DER penetration, ambitious climate policy, substantial socioeconomic diversity and pronounced spatial inequality. The study is area-level and cross-sectional; we report conditional associations, not causal effects. The central finding is that the form of inequity changes by technology, and that for charging</w:t>
+      </w:r>
+      <w:r>
+        <w:t>,</w:t>
+      </w:r>
+      <w:r>
+        <w:t xml:space="preserve"> the standard metric — the count of installed units — does not measure what equity policy assumes it measures.</w:t>
       </w:r>
     </w:p>
     <w:p>
@@ -144,11 +120,11 @@
           <w:numId w:val="11"/>
         </w:numPr>
       </w:pPr>
-      <w:bookmarkStart w:id="2" w:name="_Ref_sec_results"/>
+      <w:bookmarkStart w:id="3" w:name="_Ref_sec_results"/>
       <w:r>
         <w:t>Results</w:t>
       </w:r>
-      <w:bookmarkEnd w:id="2"/>
+      <w:bookmarkEnd w:id="3"/>
     </w:p>
     <w:p>
       <w:pPr>
@@ -160,15 +136,7 @@
     </w:p>
     <w:p>
       <w:r>
-        <w:t xml:space="preserve">Racial and socioeconomic disparities are not uniform across technologies. In the baseline specification (Table 1), rooftop photovoltaics and battery storage both carry clear negative associations with ZCTA shares of Black and Asian residents after conditioning on income and poverty. EV charging departs from that pattern: charger deployment is negatively associated with Hispanic share and positively associated with poverty rate. Coefficients reported throughout use standardized predictors, so a coefficient is the change in the </w:t>
-      </w:r>
-      <w:proofErr w:type="gramStart"/>
-      <w:r>
-        <w:t>log(</w:t>
-      </w:r>
-      <w:proofErr w:type="gramEnd"/>
-      <w:r>
-        <w:t>1 + rate) outcome associated with a one-standard-deviation change in the predictor; one standard deviation is 6.6 percentage points for Black share, 23.8 for Hispanic share and 14.1 for Asian share, and a coefficient near −0.10 corresponds to roughly a 10 percent lower deployment rate (Supplementary Table S3).</w:t>
+        <w:t>Racial and socioeconomic disparities are not uniform across technologies. In the baseline specification (Table 1), rooftop photovoltaics and battery storage both carry clear negative associations with ZCTA shares of Black and Asian residents after conditioning on income and poverty. EV charging departs from that pattern: charger deployment is negatively associated with Hispanic share and positively associated with poverty rate. Coefficients reported throughout use standardized predictors, so a coefficient is the change in the log(1 + rate) outcome associated with a one-standard-deviation change in the predictor; one standard deviation is 6.6 percentage points for Black share, 23.8 for Hispanic share and 14.1 for Asian share, and a coefficient near −0.10 corresponds to roughly a 10 percent lower deployment rate (Supplementary Table S3).</w:t>
       </w:r>
     </w:p>
     <w:p>
@@ -647,6 +615,9 @@
     </w:tbl>
     <w:p>
       <w:r>
+        <w:br/>
+      </w:r>
+      <w:r>
         <w:t>Figure 2 traces the five focal coefficients across the model series, in which each specification adds or substitutes one control block against a fixed core. Reading the three panels together is the paper's central comparison. The storage coefficients are the largest and the flattest: race and ethnicity shares stay negative and separated from zero across every specification. The solar coefficients are smaller and move more, particularly where housing enters. The charging coefficients behave differently again, with poverty rate the only consistently signed predictor and the race terms crossing zero. Whatever is producing inequity is not one mechanism operating at three intensities.</w:t>
       </w:r>
     </w:p>
@@ -705,24 +676,52 @@
       <w:pPr>
         <w:pStyle w:val="Caption"/>
       </w:pPr>
-      <w:r>
-        <w:t xml:space="preserve">Fig. 2 | Focal coefficients across the model series, by technology. Standardized predictors. Each specification adds or substitutes one control block against a fixed core of income, race and ethnicity shares, poverty rate and the outcome-specific resource control; specifications are siblings rather than nested </w:t>
-      </w:r>
-      <w:proofErr w:type="gramStart"/>
-      <w:r>
-        <w:t>rungs, and</w:t>
-      </w:r>
-      <w:proofErr w:type="gramEnd"/>
-      <w:r>
-        <w:t xml:space="preserve"> are defined in Supplementary Note S1. The storage coefficients (b) are the largest and the flattest; the charging coefficients (c) are the only set in which race terms cross zero.</w:t>
+      <w:commentRangeStart w:id="4"/>
+      <w:r>
+        <w:t>Fig. 2 | Focal coefficients across the model series, by technology</w:t>
+      </w:r>
+      <w:commentRangeEnd w:id="4"/>
+      <w:r>
+        <w:rPr>
+          <w:rStyle w:val="CommentReference"/>
+          <w:sz w:val="18"/>
+          <w:szCs w:val="18"/>
+        </w:rPr>
+        <w:commentReference w:id="4"/>
+      </w:r>
+      <w:r>
+        <w:t xml:space="preserve">. Standardized predictors. Each specification adds or substitutes one control block against a fixed core of income, race and ethnicity shares, poverty rate and the outcome-specific resource control; specifications are siblings rather than nested rungs, and are defined in Supplementary Note S1. The storage coefficients (b) are the largest and the flattest; </w:t>
+      </w:r>
+      <w:commentRangeStart w:id="5"/>
+      <w:r>
+        <w:t>the charging coefficients (c) are the only set in which race terms cross zero.</w:t>
+      </w:r>
+      <w:commentRangeEnd w:id="5"/>
+      <w:r>
+        <w:rPr>
+          <w:rStyle w:val="CommentReference"/>
+          <w:sz w:val="18"/>
+          <w:szCs w:val="18"/>
+        </w:rPr>
+        <w:commentReference w:id="5"/>
       </w:r>
     </w:p>
     <w:p>
       <w:pPr>
         <w:pStyle w:val="Heading2"/>
       </w:pPr>
+      <w:commentRangeStart w:id="6"/>
       <w:r>
         <w:t>Battery storage: the deepest and most persistent disparities</w:t>
+      </w:r>
+      <w:commentRangeEnd w:id="6"/>
+      <w:r>
+        <w:rPr>
+          <w:rStyle w:val="CommentReference"/>
+          <w:sz w:val="26"/>
+          <w:szCs w:val="26"/>
+        </w:rPr>
+        <w:commentReference w:id="6"/>
       </w:r>
     </w:p>
     <w:p>
@@ -733,7 +732,30 @@
     <w:p>
       <w:r>
         <w:lastRenderedPageBreak/>
-        <w:t>It also survives every robustness check we ran. Under Conley spatially robust standard errors the Asian- and Hispanic-share coefficients hold at every distance cutoff. Across all 48 valid combinations of the six confounder blocks, the Asian-share coefficient is significant and same-signed in 48 of 48, Hispanic share in 44 and Black share in 36 — the highest counts for any outcome. Oster bounds put storage Hispanic share at δ = 1.99 and Asian share at 1.29, both above the conventional threshold of one, meaning selection on unobservables would have to be stronger than selection on the observed confounders to explain them away (Table 2). A Poisson model fitted to raw capacity with a population offset, and a spatial error model, reproduce all three signs and significances (Supplementary Tables S8 and S10).</w:t>
+        <w:t xml:space="preserve">It also survives every robustness check we ran. Under Conley spatially robust standard errors the Asian- and Hispanic-share coefficients hold at every distance cutoff. Across all 48 valid combinations of the six confounder blocks, the Asian-share coefficient is significant and same-signed in 48 of 48, Hispanic share in 44 and Black share in 36 — the highest counts for any outcome. </w:t>
+      </w:r>
+      <w:bookmarkStart w:id="7" w:name="OLE_LINK3"/>
+      <w:bookmarkStart w:id="8" w:name="OLE_LINK4"/>
+      <w:commentRangeStart w:id="9"/>
+      <w:r>
+        <w:t xml:space="preserve">Oster bounds </w:t>
+      </w:r>
+      <w:bookmarkEnd w:id="7"/>
+      <w:r>
+        <w:t xml:space="preserve">put storage Hispanic share at δ = 1.99 and Asian share at 1.29, both above the conventional threshold of one, meaning selection on unobservables would have to be stronger than selection on the observed confounders to explain them away (Table 2). </w:t>
+      </w:r>
+      <w:bookmarkEnd w:id="8"/>
+      <w:commentRangeEnd w:id="9"/>
+      <w:r>
+        <w:rPr>
+          <w:rStyle w:val="CommentReference"/>
+          <w:sz w:val="22"/>
+          <w:szCs w:val="22"/>
+        </w:rPr>
+        <w:commentReference w:id="9"/>
+      </w:r>
+      <w:r>
+        <w:t>A Poisson model fitted to raw capacity with a population offset, and a spatial error model, reproduce all three signs and significances (Supplementary Tables S8 and S10).</w:t>
       </w:r>
     </w:p>
     <w:p>
@@ -761,28 +783,44 @@
     </w:p>
     <w:p>
       <w:r>
-        <w:t>Housing is tested directly rather than left as a proposed mechanism. Adding the exhaustive ACS B25024 structure composition, with single-family units as the reference, and B25003 owner occupancy, with renters as the reference, moves every race coefficient for solar and storage toward zero without eliminating it (Figure 3). Area-level housing composition absorbs between 32 and 53 percent of these coefficients across the four technology-by-race combinations, most for the solar Black share and least for the storage Asian share (Supplementary Table S2). Movement toward zero is attenuation associated with area-level housing composition; these models do not identify household-level tenure or roof access.</w:t>
+        <w:t xml:space="preserve">Housing is tested directly rather than left as a proposed mechanism. Adding the exhaustive </w:t>
+      </w:r>
+      <w:commentRangeStart w:id="10"/>
+      <w:r>
+        <w:t>ACS B25024 structure composition, with single-family units as the reference, and B25003 owner occupancy</w:t>
+      </w:r>
+      <w:commentRangeEnd w:id="10"/>
+      <w:r>
+        <w:rPr>
+          <w:rStyle w:val="CommentReference"/>
+          <w:sz w:val="22"/>
+          <w:szCs w:val="22"/>
+        </w:rPr>
+        <w:commentReference w:id="10"/>
+      </w:r>
+      <w:r>
+        <w:t>, with renters as the reference, moves every race coefficient for solar and storage toward zero without eliminating it (Figure 3). Area-level housing composition absorbs between 32 and 53 percent of these coefficients across the four technology-by-race combinations, most for the solar Black share and least for the storage Asian share (Supplementary Table S2). Movement toward zero is attenuation associated with area-level housing composition; these models do not identify household-level tenure or roof access.</w:t>
       </w:r>
     </w:p>
     <w:p>
       <w:r>
-        <w:t xml:space="preserve">The two solar race coefficients are not equally solid, and the paper should not treat them as though they were. The Asian-share coefficient is robust: significant at the 0.1 percent level at every Conley distance cutoff, same-signed and significant in 34 of 48 specification-curve </w:t>
-      </w:r>
-      <w:proofErr w:type="gramStart"/>
-      <w:r>
-        <w:t>combinations, and</w:t>
-      </w:r>
-      <w:proofErr w:type="gramEnd"/>
-      <w:r>
-        <w:t xml:space="preserve"> clearing the Oster threshold at δ = 1.57. The Black-share coefficient is weaker on all three measures — 28 of 48, δ = 0.32, and less precisely estimated than the heteroskedasticity-robust errors imply once residuals are allowed to covary with distance. We report </w:t>
-      </w:r>
-      <w:proofErr w:type="gramStart"/>
-      <w:r>
-        <w:t>both, and</w:t>
-      </w:r>
-      <w:proofErr w:type="gramEnd"/>
-      <w:r>
-        <w:t xml:space="preserve"> rest the solar conclusion on the Asian-share result.</w:t>
+        <w:t xml:space="preserve">The two solar race coefficients are not equally solid, </w:t>
+      </w:r>
+      <w:commentRangeStart w:id="11"/>
+      <w:r>
+        <w:t>and the paper should not treat them as though they were</w:t>
+      </w:r>
+      <w:commentRangeEnd w:id="11"/>
+      <w:r>
+        <w:rPr>
+          <w:rStyle w:val="CommentReference"/>
+          <w:sz w:val="22"/>
+          <w:szCs w:val="22"/>
+        </w:rPr>
+        <w:commentReference w:id="11"/>
+      </w:r>
+      <w:r>
+        <w:t>. The Asian-share coefficient is robust: significant at the 0.1 percent level at every Conley distance cutoff, same-signed and significant in 34 of 48 specification-curve combinations, and clearing the Oster threshold at δ = 1.57. The Black-share coefficient is weaker on all three measures — 28 of 48, δ = 0.32, and less precisely estimated than the heteroskedasticity-robust errors imply once residuals are allowed to covary with distance. We report both, and rest the solar conclusion on the Asian-share result.</w:t>
       </w:r>
     </w:p>
     <w:p>
@@ -815,7 +853,7 @@
                     <pic:cNvPicPr/>
                   </pic:nvPicPr>
                   <pic:blipFill>
-                    <a:blip r:embed="rId9"/>
+                    <a:blip r:embed="rId13"/>
                     <a:stretch>
                       <a:fillRect/>
                     </a:stretch>
@@ -864,15 +902,7 @@
     </w:p>
     <w:p>
       <w:r>
-        <w:t xml:space="preserve">Two features of the charger data govern how these counts should be read. The inventory records public and shared-use stations only — every station row is flagged public access — so residential charging is unobserved, and no measure in this study speaks to whether a household can charge where it parks overnight. And because the association concentrates in Level 2 units rather than the slowest ports, the pattern is consistent with siting driven by commercial and industrial activity rather than by household-serving provision. We treat that siting interpretation as a hypothesis: the dataset carries no charger-host or facility-type field, so it is not directly tested here. What the data do establish is narrower and still consequential — a higher charger count in a higher-poverty ZCTA is not evidence of better household charging access, because the counts do not include the charging that households </w:t>
-      </w:r>
-      <w:proofErr w:type="gramStart"/>
-      <w:r>
-        <w:t>actually use</w:t>
-      </w:r>
-      <w:proofErr w:type="gramEnd"/>
-      <w:r>
-        <w:t>.</w:t>
+        <w:t>Two features of the charger data govern how these counts should be read. The inventory records public and shared-use stations only — every station row is flagged public access — so residential charging is unobserved, and no measure in this study speaks to whether a household can charge where it parks overnight. And because the association concentrates in Level 2 units rather than the slowest ports, the pattern is consistent with siting driven by commercial and industrial activity rather than by household-serving provision. We treat that siting interpretation as a hypothesis: the dataset carries no charger-host or facility-type field, so it is not directly tested here. What the data do establish is narrower and still consequential — a higher charger count in a higher-poverty ZCTA is not evidence of better household charging access, because the counts do not include the charging that households actually use.</w:t>
       </w:r>
     </w:p>
     <w:p>
@@ -901,7 +931,7 @@
                     <pic:cNvPicPr/>
                   </pic:nvPicPr>
                   <pic:blipFill rotWithShape="1">
-                    <a:blip r:embed="rId10"/>
+                    <a:blip r:embed="rId14"/>
                     <a:srcRect b="4383"/>
                     <a:stretch>
                       <a:fillRect/>
@@ -943,8 +973,18 @@
       <w:pPr>
         <w:pStyle w:val="Heading2"/>
       </w:pPr>
+      <w:commentRangeStart w:id="12"/>
       <w:r>
         <w:t>Disparities under a fully stacked specification</w:t>
+      </w:r>
+      <w:commentRangeEnd w:id="12"/>
+      <w:r>
+        <w:rPr>
+          <w:rStyle w:val="CommentReference"/>
+          <w:sz w:val="26"/>
+          <w:szCs w:val="26"/>
+        </w:rPr>
+        <w:commentReference w:id="12"/>
       </w:r>
     </w:p>
     <w:p>
@@ -990,11 +1030,17 @@
         <w:gridCol w:w="990"/>
       </w:tblGrid>
       <w:tr>
+        <w:trPr>
+          <w:trHeight w:val="213"/>
+        </w:trPr>
         <w:tc>
           <w:tcPr>
             <w:tcW w:w="1620" w:type="dxa"/>
           </w:tcPr>
           <w:p>
+            <w:pPr>
+              <w:jc w:val="center"/>
+            </w:pPr>
             <w:r>
               <w:rPr>
                 <w:b/>
@@ -1008,6 +1054,9 @@
             <w:tcW w:w="1350" w:type="dxa"/>
           </w:tcPr>
           <w:p>
+            <w:pPr>
+              <w:jc w:val="center"/>
+            </w:pPr>
             <w:r>
               <w:rPr>
                 <w:b/>
@@ -1021,6 +1070,9 @@
             <w:tcW w:w="971" w:type="dxa"/>
           </w:tcPr>
           <w:p>
+            <w:pPr>
+              <w:jc w:val="center"/>
+            </w:pPr>
             <w:r>
               <w:rPr>
                 <w:b/>
@@ -1034,6 +1086,9 @@
             <w:tcW w:w="1166" w:type="dxa"/>
           </w:tcPr>
           <w:p>
+            <w:pPr>
+              <w:jc w:val="center"/>
+            </w:pPr>
             <w:r>
               <w:rPr>
                 <w:b/>
@@ -1047,6 +1102,9 @@
             <w:tcW w:w="2723" w:type="dxa"/>
           </w:tcPr>
           <w:p>
+            <w:pPr>
+              <w:jc w:val="center"/>
+            </w:pPr>
             <w:r>
               <w:rPr>
                 <w:b/>
@@ -1076,6 +1134,9 @@
             <w:tcW w:w="990" w:type="dxa"/>
           </w:tcPr>
           <w:p>
+            <w:pPr>
+              <w:jc w:val="center"/>
+            </w:pPr>
             <w:r>
               <w:rPr>
                 <w:b/>
@@ -1935,11 +1996,11 @@
           <w:numId w:val="11"/>
         </w:numPr>
       </w:pPr>
-      <w:bookmarkStart w:id="3" w:name="_Ref_sec_discussion"/>
+      <w:bookmarkStart w:id="13" w:name="_Ref_sec_discussion"/>
       <w:r>
         <w:t>Discussion</w:t>
       </w:r>
-      <w:bookmarkEnd w:id="3"/>
+      <w:bookmarkEnd w:id="13"/>
     </w:p>
     <w:p>
       <w:pPr>
@@ -1951,15 +2012,7 @@
     </w:p>
     <w:p>
       <w:r>
-        <w:t xml:space="preserve">The clean energy transition does not reproduce inequality in the same way across technologies. Storage is the clearest case: the deepest disparities in the study, stable across every specification in the model series, and the only outcome whose race coefficients survive a fully stacked specification, a specification curve and a spatial error model alike. Rooftop solar shows racial and socioeconomic patterning that housing composition substantially, though not entirely, explains, and whose surviving component is carried by Asian share rather than by Black share. Aggregate charging does not fit an underserved-versus-served story at all; the measure mixes infrastructure types that serve different users under different siting logics. A community that appears relatively well served on one aggregate metric may still be underserved in the specific benefit that matters — bill savings from PV, resilience from storage, or charging it can </w:t>
-      </w:r>
-      <w:proofErr w:type="gramStart"/>
-      <w:r>
-        <w:t>actually use</w:t>
-      </w:r>
-      <w:proofErr w:type="gramEnd"/>
-      <w:r>
-        <w:t>.</w:t>
+        <w:t>The clean energy transition does not reproduce inequality in the same way across technologies. Storage is the clearest case: the deepest disparities in the study, stable across every specification in the model series, and the only outcome whose race coefficients survive a fully stacked specification, a specification curve and a spatial error model alike. Rooftop solar shows racial and socioeconomic patterning that housing composition substantially, though not entirely, explains, and whose surviving component is carried by Asian share rather than by Black share. Aggregate charging does not fit an underserved-versus-served story at all; the measure mixes infrastructure types that serve different users under different siting logics. A community that appears relatively well served on one aggregate metric may still be underserved in the specific benefit that matters — bill savings from PV, resilience from storage, or charging it can actually use.</w:t>
       </w:r>
     </w:p>
     <w:p>
@@ -1977,15 +2030,7 @@
     </w:p>
     <w:p>
       <w:r>
-        <w:t xml:space="preserve">One result </w:t>
-      </w:r>
-      <w:proofErr w:type="gramStart"/>
-      <w:r>
-        <w:t>runs</w:t>
-      </w:r>
-      <w:proofErr w:type="gramEnd"/>
-      <w:r>
-        <w:t xml:space="preserve"> against the expected direction and deserves its own explanation. Adding the full confounder set does not shrink the PV income coefficient; it increases it. Education, housing value, structure, tenure and </w:t>
+        <w:t xml:space="preserve">One result runs against the expected direction and deserves its own explanation. Adding the full confounder set does not shrink the PV income coefficient; it increases it. Education, housing value, structure, tenure and </w:t>
       </w:r>
       <w:r>
         <w:lastRenderedPageBreak/>
@@ -2030,7 +2075,7 @@
     </w:p>
     <w:p>
       <w:r>
-        <w:t xml:space="preserve">Two further levers sit outside consumer programs. Adoption is partly gated by hosting-capacity and interconnection frictions that are themselves socially patterned [11], [12]; operators can publish hosting-capacity and interconnection-queue outcomes disaggregated by community demographics and pilot fairness-aware allocation so that grid upgrades do not concentrate where adoption is already high. And persistent PV and storage gaps after income controls point at non-price barriers — installer market penetration, financing access, split </w:t>
+        <w:t xml:space="preserve">Two further levers sit outside consumer programs. Adoption is partly gated by hosting-capacity and interconnection frictions that are themselves socially patterned [11][12]; operators can publish hosting-capacity and interconnection-queue outcomes disaggregated by community demographics and pilot fairness-aware allocation so that grid upgrades do not concentrate where adoption is already high. And persistent PV and storage gaps after income controls point at non-price barriers — installer market penetration, financing access, split </w:t>
       </w:r>
       <w:r>
         <w:lastRenderedPageBreak/>
@@ -2050,11 +2095,11 @@
           <w:numId w:val="11"/>
         </w:numPr>
       </w:pPr>
-      <w:bookmarkStart w:id="4" w:name="_Ref_sec_methods"/>
+      <w:bookmarkStart w:id="14" w:name="_Ref_sec_methods"/>
       <w:r>
         <w:t>Methods</w:t>
       </w:r>
-      <w:bookmarkEnd w:id="4"/>
+      <w:bookmarkEnd w:id="14"/>
     </w:p>
     <w:p>
       <w:pPr>
@@ -2123,23 +2168,7 @@
           <w:rFonts w:ascii="Courier New" w:hAnsi="Courier New"/>
           <w:sz w:val="18"/>
         </w:rPr>
-        <w:t xml:space="preserve"> </w:t>
-      </w:r>
-      <w:proofErr w:type="gramStart"/>
-      <w:r>
-        <w:rPr>
-          <w:rFonts w:ascii="Courier New" w:hAnsi="Courier New"/>
-          <w:sz w:val="18"/>
-        </w:rPr>
-        <w:t>log(</w:t>
-      </w:r>
-      <w:proofErr w:type="gramEnd"/>
-      <w:r>
-        <w:rPr>
-          <w:rFonts w:ascii="Courier New" w:hAnsi="Courier New"/>
-          <w:sz w:val="18"/>
-        </w:rPr>
-        <w:t>1 + rate)</w:t>
+        <w:t xml:space="preserve"> log(1 + rate)</w:t>
       </w:r>
       <w:r>
         <w:t xml:space="preserve"> specification to reduce skew and retain observations with zero deployment. The main explanatory variables of interest are racial/ethnic composition measures and socioeconomic indicators. We then add contextual controls that capture climate, renewable resource potential, utility territory, built-environment structure, and broader installed-energy context.</w:t>
@@ -2182,15 +2211,7 @@
     </w:p>
     <w:p>
       <w:r>
-        <w:t>The unit of analysis is the ZIP-code level, implemented using Census ZIP Code Tabulation Areas (ZCTAs</w:t>
-      </w:r>
-      <w:proofErr w:type="gramStart"/>
-      <w:r>
-        <w:t>),  which</w:t>
-      </w:r>
-      <w:proofErr w:type="gramEnd"/>
-      <w:r>
-        <w:t xml:space="preserve"> are geographic entities defined by the U.S. Census Bureau to approximate ZIP code service areas. ZCTA geography is the most practical common denominator across the DER, demographic, and contextual assembled source files. The analysis is therefore an area-level California snapshot rather than a household panel, and it is framed as a 2023 cross-section using the most recent aligned observations available through that year. All the important variables used for the targets, predictors, and controls are defined in </w:t>
+        <w:t xml:space="preserve">The unit of analysis is the ZIP-code level, implemented using Census ZIP Code Tabulation Areas (ZCTAs),  which are geographic entities defined by the U.S. Census Bureau to approximate ZIP code service areas. ZCTA geography is the most practical common denominator across the DER, demographic, and contextual assembled source files. The analysis is therefore an area-level California snapshot rather than a household panel, and it is framed as a 2023 cross-section using the most recent aligned observations available through that year. All the important variables used for the targets, predictors, and controls are defined in </w:t>
       </w:r>
       <w:r>
         <w:fldChar w:fldCharType="begin"/>
@@ -2261,15 +2282,7 @@
         <w:fldChar w:fldCharType="end"/>
       </w:r>
       <w:r>
-        <w:t xml:space="preserve"> shows that the three DER outcomes are </w:t>
-      </w:r>
-      <w:proofErr w:type="gramStart"/>
-      <w:r>
-        <w:t>right-skewed</w:t>
-      </w:r>
-      <w:proofErr w:type="gramEnd"/>
-      <w:r>
-        <w:t xml:space="preserve">, while the socioeconomic context variables span materially different neighborhood conditions. </w:t>
+        <w:t xml:space="preserve"> shows that the three DER outcomes are right-skewed, while the socioeconomic context variables span materially different neighborhood conditions. </w:t>
       </w:r>
       <w:r>
         <w:fldChar w:fldCharType="begin"/>
@@ -2298,30 +2311,22 @@
           <w:numId w:val="11"/>
         </w:numPr>
       </w:pPr>
-      <w:bookmarkStart w:id="5" w:name="_Ref_sec_m_data"/>
+      <w:bookmarkStart w:id="15" w:name="_Ref_sec_m_data"/>
       <w:r>
         <w:t>Dataset Construction and Sample</w:t>
       </w:r>
-      <w:bookmarkEnd w:id="5"/>
+      <w:bookmarkEnd w:id="15"/>
     </w:p>
     <w:p>
       <w:r>
-        <w:t xml:space="preserve">Two properties of the source data govern how the outcomes should be read. The EV charging inventory records public and shared-use stations only: every station row in the source file carries a public access flag, and the statewide Level 1 total is 256 ports against 40,078 Level 2 and 13,852 DC fast. Residential charging is therefore unobserved, and no charging measure in this study speaks to whether a household can charge where it parks. The storage series is drawn from the California Energy Commission storage system survey and is overwhelmingly customer-sited: the underlying records are 4,957 residential, 41 commercial and 2 </w:t>
-      </w:r>
-      <w:proofErr w:type="gramStart"/>
-      <w:r>
-        <w:t>utility</w:t>
-      </w:r>
-      <w:proofErr w:type="gramEnd"/>
-      <w:r>
-        <w:t>, so the behind-the-meter reading of the storage results is supported by the source. A sensitivity excluding non-residential records is reported in Supplementary Table S16.</w:t>
+        <w:t>Two properties of the source data govern how the outcomes should be read. The EV charging inventory records public and shared-use stations only: every station row in the source file carries a public access flag, and the statewide Level 1 total is 256 ports against 40,078 Level 2 and 13,852 DC fast. Residential charging is therefore unobserved, and no charging measure in this study speaks to whether a household can charge where it parks. The storage series is drawn from the California Energy Commission storage system survey and is overwhelmingly customer-sited: the underlying records are 4,957 residential, 41 commercial and 2 utility, so the behind-the-meter reading of the storage results is supported by the source. A sensitivity excluding non-residential records is reported in Supplementary Table S16.</w:t>
       </w:r>
     </w:p>
     <w:p>
       <w:r>
         <w:t xml:space="preserve">The analysis uses a California ZCTA-level dataset created by merging multiple DER source files with demographic, climate, utility, and infrastructure controls. The final merged file combines measures of solar PV capacity, battery storage capacity, and EV charging infrastructure with American Community Survey variables and place-based controls. The data-construction pipeline and analysis code are available at </w:t>
       </w:r>
-      <w:hyperlink r:id="rId11" w:history="1">
+      <w:hyperlink r:id="rId15" w:history="1">
         <w:r>
           <w:rPr>
             <w:rStyle w:val="Hyperlink"/>
@@ -2333,28 +2338,12 @@
         <w:t xml:space="preserve"> </w:t>
       </w:r>
       <w:r>
-        <w:t xml:space="preserve">under the MIT License. The harmonized ZCTA analysis file will be deposited as a separate </w:t>
-      </w:r>
-      <w:proofErr w:type="spellStart"/>
-      <w:r>
-        <w:t>Zenodo</w:t>
-      </w:r>
-      <w:proofErr w:type="spellEnd"/>
-      <w:r>
-        <w:t xml:space="preserve"> record under CC-BY-4.0.</w:t>
+        <w:t>under the MIT License. The harmonized ZCTA analysis file will be deposited as a separate Zenodo record under CC-BY-4.0.</w:t>
       </w:r>
     </w:p>
     <w:p>
       <w:r>
-        <w:t xml:space="preserve">DER measures are first constructed separately by technology and then aggregated to the ZCTA level. Solar PV capacity is derived from Tracking the Sun installation records [19]. Battery storage is built from a California storage dataset containing location and capacity information [21]. EV charging infrastructure is constructed from charger-level records that include charger type and location [22]; charger rows without a valid source ZIP are excluded from ZCTA charger outcomes rather than reassigned using latitude/longitude, while valid source-ZIP rows are retained even if descriptive fields are blank or say No information. Wind capacity and turbine counts come from the USGS wind turbine database [23], power-plant capacity from the EIA power plants layer [24], interconnection records from California Distributed Generation Statistics [20], ZCTA boundaries from Census TIGER/Line shapefiles [26], and energy burden measures from the California Energy Commission energy equity indicators [28]. Figure 1 visualizes the resulting statewide geography </w:t>
-      </w:r>
-      <w:proofErr w:type="gramStart"/>
-      <w:r>
-        <w:t>and also</w:t>
-      </w:r>
-      <w:proofErr w:type="gramEnd"/>
-      <w:r>
-        <w:t xml:space="preserve"> makes clear that some ZCTAs are absent because the underlying merged sample is incomplete in those places.</w:t>
+        <w:t>DER measures are first constructed separately by technology and then aggregated to the ZCTA level. Solar PV capacity is derived from Tracking the Sun installation records [19]. Battery storage is built from a California storage dataset containing location and capacity information [21]. EV charging infrastructure is constructed from charger-level records that include charger type and location [22]; charger rows without a valid source ZIP are excluded from ZCTA charger outcomes rather than reassigned using latitude/longitude, while valid source-ZIP rows are retained even if descriptive fields are blank or say No information. Wind capacity and turbine counts come from the USGS wind turbine database [23], power-plant capacity from the EIA power plants layer [24], interconnection records from California Distributed Generation Statistics [20], ZCTA boundaries from Census TIGER/Line shapefiles [26], and energy burden measures from the California Energy Commission energy equity indicators [28]. Figure 1 visualizes the resulting statewide geography and also makes clear that some ZCTAs are absent because the underlying merged sample is incomplete in those places.</w:t>
       </w:r>
       <w:hyperlink w:anchor="_Ref_src26" w:history="1"/>
       <w:hyperlink w:anchor="_Ref_src28" w:history="1"/>
@@ -2380,31 +2369,25 @@
     <w:p>
       <w:r>
         <w:lastRenderedPageBreak/>
-        <w:t xml:space="preserve">After source-specific cleaning, the DER measures are merged with contextual predictors. Demographic and socioeconomic variables come from the 2023 American Community Survey 5-year </w:t>
-      </w:r>
-      <w:proofErr w:type="gramStart"/>
-      <w:r>
-        <w:t>estimates[</w:t>
-      </w:r>
-      <w:proofErr w:type="gramEnd"/>
-      <w:r>
-        <w:t xml:space="preserve">25]. Housing structure uses every category in ACS B25024: single-family, multifamily, mobile-home, and boat/RV/van/other shares sum to one. Tenure uses B25003 owner occupancy, with renter occupancy as its complement. Climate and renewable-resource controls come from NASA </w:t>
-      </w:r>
-      <w:proofErr w:type="gramStart"/>
-      <w:r>
-        <w:t>POWER[</w:t>
-      </w:r>
-      <w:proofErr w:type="gramEnd"/>
-      <w:r>
-        <w:t xml:space="preserve">27]; utility territory uses a ZIP-to-utility spatial crosswalk; and annualized utility usage provides the electricity-demand </w:t>
-      </w:r>
-      <w:proofErr w:type="gramStart"/>
-      <w:r>
-        <w:t>proxy[</w:t>
-      </w:r>
-      <w:proofErr w:type="gramEnd"/>
-      <w:r>
-        <w:t>29].</w:t>
+        <w:t>After source-specific cleaning, the DER measures are merged with contextual predictors. Demographic and socioeconomic variables come from the 2023 American Community Survey 5-year estimates</w:t>
+      </w:r>
+      <w:r>
+        <w:t xml:space="preserve"> </w:t>
+      </w:r>
+      <w:r>
+        <w:t>[25]. Housing structure uses every category in ACS B25024: single-family, multifamily, mobile-home, and boat/RV/van/other shares sum to one. Tenure uses B25003 owner occupancy, with renter occupancy as its complement. Climate and renewable-resource controls come from NASA POWER</w:t>
+      </w:r>
+      <w:r>
+        <w:t xml:space="preserve"> </w:t>
+      </w:r>
+      <w:r>
+        <w:t>[27]; utility territory uses a ZIP-to-utility spatial crosswalk; and annualized utility usage provides the electricity-demand proxy</w:t>
+      </w:r>
+      <w:r>
+        <w:t xml:space="preserve"> </w:t>
+      </w:r>
+      <w:r>
+        <w:t>[29].</w:t>
       </w:r>
       <w:hyperlink w:anchor="_Ref_src32" w:history="1"/>
       <w:hyperlink w:anchor="_Ref_src34" w:history="1"/>
@@ -2441,11 +2424,11 @@
           <w:numId w:val="11"/>
         </w:numPr>
       </w:pPr>
-      <w:bookmarkStart w:id="6" w:name="_Ref_sec_m_outcomes"/>
+      <w:bookmarkStart w:id="16" w:name="_Ref_sec_m_outcomes"/>
       <w:r>
         <w:t>Outcome Variables</w:t>
       </w:r>
-      <w:bookmarkEnd w:id="6"/>
+      <w:bookmarkEnd w:id="16"/>
     </w:p>
     <w:p>
       <w:r>
@@ -2457,25 +2440,7 @@
           <w:sz w:val="18"/>
           <w:szCs w:val="18"/>
         </w:rPr>
-        <w:t xml:space="preserve"> </w:t>
-      </w:r>
-      <w:proofErr w:type="gramStart"/>
-      <w:r>
-        <w:rPr>
-          <w:rFonts w:ascii="Courier New" w:hAnsi="Courier New"/>
-          <w:sz w:val="18"/>
-          <w:szCs w:val="18"/>
-        </w:rPr>
-        <w:t>log(</w:t>
-      </w:r>
-      <w:proofErr w:type="gramEnd"/>
-      <w:r>
-        <w:rPr>
-          <w:rFonts w:ascii="Courier New" w:hAnsi="Courier New"/>
-          <w:sz w:val="18"/>
-          <w:szCs w:val="18"/>
-        </w:rPr>
-        <w:t>1 + x)</w:t>
+        <w:t xml:space="preserve"> log(1 + x)</w:t>
       </w:r>
       <w:r>
         <w:t xml:space="preserve">. This helps reduce skew and allows ZCTAs with zero deployment to remain in the sample. The three main outcomes are defined as follows. Their definitions and units are also collected in </w:t>
@@ -2544,7 +2509,7 @@
       <w:r>
         <w:tab/>
       </w:r>
-      <w:bookmarkStart w:id="7" w:name="_Ref_eq_chargers"/>
+      <w:bookmarkStart w:id="17" w:name="_Ref_eq_chargers"/>
       <w:r>
         <w:t>(</w:t>
       </w:r>
@@ -2556,7 +2521,7 @@
       <w:r>
         <w:t>)</w:t>
       </w:r>
-      <w:bookmarkEnd w:id="7"/>
+      <w:bookmarkEnd w:id="17"/>
     </w:p>
     <w:p>
       <w:r>
@@ -2609,7 +2574,7 @@
       <w:r>
         <w:tab/>
       </w:r>
-      <w:bookmarkStart w:id="8" w:name="_Ref_eq_pv"/>
+      <w:bookmarkStart w:id="18" w:name="_Ref_eq_pv"/>
       <w:r>
         <w:t>(</w:t>
       </w:r>
@@ -2621,7 +2586,7 @@
       <w:r>
         <w:t>)</w:t>
       </w:r>
-      <w:bookmarkEnd w:id="8"/>
+      <w:bookmarkEnd w:id="18"/>
     </w:p>
     <w:p>
       <w:r>
@@ -2674,7 +2639,7 @@
       <w:r>
         <w:tab/>
       </w:r>
-      <w:bookmarkStart w:id="9" w:name="_Ref_eq_storage"/>
+      <w:bookmarkStart w:id="19" w:name="_Ref_eq_storage"/>
       <w:r>
         <w:t>(</w:t>
       </w:r>
@@ -2686,7 +2651,7 @@
       <w:r>
         <w:t>)</w:t>
       </w:r>
-      <w:bookmarkEnd w:id="9"/>
+      <w:bookmarkEnd w:id="19"/>
     </w:p>
     <w:p>
       <w:r>
@@ -2730,11 +2695,11 @@
           <w:numId w:val="11"/>
         </w:numPr>
       </w:pPr>
-      <w:bookmarkStart w:id="10" w:name="_Ref_sec_m_predictors"/>
+      <w:bookmarkStart w:id="20" w:name="_Ref_sec_m_predictors"/>
       <w:r>
         <w:t>Key Explanatory Variables</w:t>
       </w:r>
-      <w:bookmarkEnd w:id="10"/>
+      <w:bookmarkEnd w:id="20"/>
     </w:p>
     <w:p>
       <w:r>
@@ -2753,15 +2718,7 @@
     </w:p>
     <w:p>
       <w:r>
-        <w:t xml:space="preserve">The socioeconomic variables are intended to proxy for adoption capacity and broader social advantage. The core measures are </w:t>
-      </w:r>
-      <w:proofErr w:type="gramStart"/>
-      <w:r>
-        <w:t>log</w:t>
-      </w:r>
-      <w:proofErr w:type="gramEnd"/>
-      <w:r>
-        <w:t xml:space="preserve"> median household income and poverty rate. Additional socioeconomic variables used in extended specifications include percent bachelor’s degree or higher and log median housing value. Education is therefore treated primarily as a control rather than as the paper’s headline predictor: it captures information, housing-market position, and adoption capacity that overlap with income, but the central research question is whether race remains statistically associated with DER deployment after those proxies are included.</w:t>
+        <w:t>The socioeconomic variables are intended to proxy for adoption capacity and broader social advantage. The core measures are log median household income and poverty rate. Additional socioeconomic variables used in extended specifications include percent bachelor’s degree or higher and log median housing value. Education is therefore treated primarily as a control rather than as the paper’s headline predictor: it captures information, housing-market position, and adoption capacity that overlap with income, but the central research question is whether race remains statistically associated with DER deployment after those proxies are included.</w:t>
       </w:r>
     </w:p>
     <w:p>
@@ -2777,11 +2734,11 @@
           <w:numId w:val="11"/>
         </w:numPr>
       </w:pPr>
-      <w:bookmarkStart w:id="11" w:name="_Ref_sec_m_controls"/>
+      <w:bookmarkStart w:id="21" w:name="_Ref_sec_m_controls"/>
       <w:r>
         <w:t>Contextual Controls</w:t>
       </w:r>
-      <w:bookmarkEnd w:id="11"/>
+      <w:bookmarkEnd w:id="21"/>
     </w:p>
     <w:p>
       <w:r>
@@ -2852,11 +2809,11 @@
           <w:numId w:val="11"/>
         </w:numPr>
       </w:pPr>
-      <w:bookmarkStart w:id="12" w:name="_Ref_sec_m_baseline"/>
+      <w:bookmarkStart w:id="22" w:name="_Ref_sec_m_baseline"/>
       <w:r>
         <w:t>Baseline Regression Specification</w:t>
       </w:r>
-      <w:bookmarkEnd w:id="12"/>
+      <w:bookmarkEnd w:id="22"/>
     </w:p>
     <w:p>
       <w:r>
@@ -2870,80 +2827,14 @@
         </w:tabs>
         <w:jc w:val="center"/>
       </w:pPr>
-      <w:proofErr w:type="spellStart"/>
       <w:r>
         <w:rPr>
           <w:rFonts w:ascii="Cambria Math" w:hAnsi="Cambria Math"/>
           <w:sz w:val="18"/>
         </w:rPr>
         <w:lastRenderedPageBreak/>
-        <w:t>y_z</w:t>
-      </w:r>
-      <w:proofErr w:type="spellEnd"/>
-      <w:r>
-        <w:rPr>
-          <w:rFonts w:ascii="Cambria Math" w:hAnsi="Cambria Math"/>
-          <w:sz w:val="18"/>
-        </w:rPr>
-        <w:t xml:space="preserve"> = β₀ + β₁ </w:t>
-      </w:r>
-      <w:proofErr w:type="spellStart"/>
-      <w:r>
-        <w:rPr>
-          <w:rFonts w:ascii="Cambria Math" w:hAnsi="Cambria Math"/>
-          <w:sz w:val="18"/>
-        </w:rPr>
-        <w:t>Income_z</w:t>
-      </w:r>
-      <w:proofErr w:type="spellEnd"/>
-      <w:r>
-        <w:rPr>
-          <w:rFonts w:ascii="Cambria Math" w:hAnsi="Cambria Math"/>
-          <w:sz w:val="18"/>
-        </w:rPr>
-        <w:t xml:space="preserve"> + β₂ </w:t>
-      </w:r>
-      <w:proofErr w:type="spellStart"/>
-      <w:r>
-        <w:rPr>
-          <w:rFonts w:ascii="Cambria Math" w:hAnsi="Cambria Math"/>
-          <w:sz w:val="18"/>
-        </w:rPr>
-        <w:t>Black_z</w:t>
-      </w:r>
-      <w:proofErr w:type="spellEnd"/>
-      <w:r>
-        <w:rPr>
-          <w:rFonts w:ascii="Cambria Math" w:hAnsi="Cambria Math"/>
-          <w:sz w:val="18"/>
-        </w:rPr>
-        <w:t xml:space="preserve"> + β₃ </w:t>
-      </w:r>
-      <w:proofErr w:type="spellStart"/>
-      <w:r>
-        <w:rPr>
-          <w:rFonts w:ascii="Cambria Math" w:hAnsi="Cambria Math"/>
-          <w:sz w:val="18"/>
-        </w:rPr>
-        <w:t>Hispanic_z</w:t>
-      </w:r>
-      <w:proofErr w:type="spellEnd"/>
-      <w:r>
-        <w:rPr>
-          <w:rFonts w:ascii="Cambria Math" w:hAnsi="Cambria Math"/>
-          <w:sz w:val="18"/>
-        </w:rPr>
-        <w:t xml:space="preserve"> + β₄ </w:t>
-      </w:r>
-      <w:proofErr w:type="spellStart"/>
-      <w:r>
-        <w:rPr>
-          <w:rFonts w:ascii="Cambria Math" w:hAnsi="Cambria Math"/>
-          <w:sz w:val="18"/>
-        </w:rPr>
-        <w:t>Asian_z</w:t>
-      </w:r>
-      <w:proofErr w:type="spellEnd"/>
+        <w:t>y_z = β₀ + β₁ Income_z + β₂ Black_z + β₃ Hispanic_z + β₄ Asian_z</w:t>
+      </w:r>
       <w:r>
         <w:rPr>
           <w:rFonts w:ascii="Cambria Math" w:hAnsi="Cambria Math"/>
@@ -2956,65 +2847,9 @@
           <w:rFonts w:ascii="Cambria Math" w:hAnsi="Cambria Math"/>
           <w:sz w:val="18"/>
         </w:rPr>
-        <w:t xml:space="preserve">+ β₅ </w:t>
-      </w:r>
-      <w:proofErr w:type="spellStart"/>
-      <w:r>
-        <w:rPr>
-          <w:rFonts w:ascii="Cambria Math" w:hAnsi="Cambria Math"/>
-          <w:sz w:val="18"/>
-        </w:rPr>
-        <w:t>Poverty_z</w:t>
-      </w:r>
-      <w:proofErr w:type="spellEnd"/>
-      <w:r>
-        <w:rPr>
-          <w:rFonts w:ascii="Cambria Math" w:hAnsi="Cambria Math"/>
-          <w:sz w:val="18"/>
-        </w:rPr>
-        <w:t xml:space="preserve"> + </w:t>
-      </w:r>
-      <w:proofErr w:type="spellStart"/>
-      <w:r>
-        <w:rPr>
-          <w:rFonts w:ascii="Cambria Math" w:hAnsi="Cambria Math"/>
-          <w:sz w:val="18"/>
-        </w:rPr>
-        <w:t>γX_z</w:t>
-      </w:r>
-      <w:proofErr w:type="spellEnd"/>
-      <w:r>
-        <w:rPr>
-          <w:rFonts w:ascii="Cambria Math" w:hAnsi="Cambria Math"/>
-          <w:sz w:val="18"/>
-        </w:rPr>
-        <w:t xml:space="preserve"> + </w:t>
-      </w:r>
-      <w:proofErr w:type="spellStart"/>
-      <w:r>
-        <w:rPr>
-          <w:rFonts w:ascii="Cambria Math" w:hAnsi="Cambria Math"/>
-          <w:sz w:val="18"/>
-        </w:rPr>
-        <w:t>ε_z</w:t>
-      </w:r>
-      <w:proofErr w:type="spellEnd"/>
-      <w:r>
-        <w:rPr>
-          <w:rFonts w:ascii="Cambria Math" w:hAnsi="Cambria Math"/>
-          <w:sz w:val="18"/>
-        </w:rPr>
-        <w:t xml:space="preserve">                                     </w:t>
-      </w:r>
-      <w:proofErr w:type="gramStart"/>
-      <w:r>
-        <w:rPr>
-          <w:rFonts w:ascii="Cambria Math" w:hAnsi="Cambria Math"/>
-          <w:sz w:val="18"/>
-        </w:rPr>
-        <w:t xml:space="preserve">   </w:t>
-      </w:r>
-      <w:bookmarkStart w:id="13" w:name="_Ref_eq_baseline"/>
+        <w:t xml:space="preserve">+ β₅ Poverty_z + γX_z + ε_z                                        </w:t>
+      </w:r>
+      <w:bookmarkStart w:id="23" w:name="_Ref_eq_baseline"/>
       <w:r>
         <w:rPr>
           <w:rFonts w:ascii="Cambria Math" w:hAnsi="Cambria Math"/>
@@ -3022,7 +2857,6 @@
         </w:rPr>
         <w:t>(</w:t>
       </w:r>
-      <w:proofErr w:type="gramEnd"/>
       <w:r>
         <w:rPr>
           <w:rFonts w:ascii="Cambria Math" w:hAnsi="Cambria Math"/>
@@ -3065,75 +2899,11 @@
         </w:rPr>
         <w:t>)</w:t>
       </w:r>
-      <w:bookmarkEnd w:id="13"/>
+      <w:bookmarkEnd w:id="23"/>
     </w:p>
     <w:p>
       <w:r>
-        <w:t xml:space="preserve">where </w:t>
-      </w:r>
-      <w:proofErr w:type="spellStart"/>
-      <w:r>
-        <w:t>y_z</w:t>
-      </w:r>
-      <w:proofErr w:type="spellEnd"/>
-      <w:r>
-        <w:t xml:space="preserve"> is the DER deployment outcome in ZCTA z, </w:t>
-      </w:r>
-      <w:proofErr w:type="spellStart"/>
-      <w:r>
-        <w:t>Income_z</w:t>
-      </w:r>
-      <w:proofErr w:type="spellEnd"/>
-      <w:r>
-        <w:t xml:space="preserve"> is log median household income, </w:t>
-      </w:r>
-      <w:proofErr w:type="spellStart"/>
-      <w:r>
-        <w:t>Black_z</w:t>
-      </w:r>
-      <w:proofErr w:type="spellEnd"/>
-      <w:r>
-        <w:t xml:space="preserve">, </w:t>
-      </w:r>
-      <w:proofErr w:type="spellStart"/>
-      <w:r>
-        <w:t>Hispanic_z</w:t>
-      </w:r>
-      <w:proofErr w:type="spellEnd"/>
-      <w:r>
-        <w:t xml:space="preserve">, and </w:t>
-      </w:r>
-      <w:proofErr w:type="spellStart"/>
-      <w:r>
-        <w:t>Asian_z</w:t>
-      </w:r>
-      <w:proofErr w:type="spellEnd"/>
-      <w:r>
-        <w:t xml:space="preserve"> are race/ethnicity population shares, </w:t>
-      </w:r>
-      <w:proofErr w:type="spellStart"/>
-      <w:r>
-        <w:t>Poverty_z</w:t>
-      </w:r>
-      <w:proofErr w:type="spellEnd"/>
-      <w:r>
-        <w:t xml:space="preserve"> is the ZCTA poverty rate, </w:t>
-      </w:r>
-      <w:proofErr w:type="spellStart"/>
-      <w:r>
-        <w:t>X_z</w:t>
-      </w:r>
-      <w:proofErr w:type="spellEnd"/>
-      <w:r>
-        <w:t xml:space="preserve"> is a vector of contextual controls for ZCTA z, and </w:t>
-      </w:r>
-      <w:proofErr w:type="spellStart"/>
-      <w:r>
-        <w:t>ε_z</w:t>
-      </w:r>
-      <w:proofErr w:type="spellEnd"/>
-      <w:r>
-        <w:t xml:space="preserve"> is the error term. Estimates of Equation </w:t>
+        <w:t xml:space="preserve">where y_z is the DER deployment outcome in ZCTA z, Income_z is log median household income, Black_z, Hispanic_z, and Asian_z are race/ethnicity population shares, Poverty_z is the ZCTA poverty rate, X_z is a vector of contextual controls for ZCTA z, and ε_z is the error term. Estimates of Equation </w:t>
       </w:r>
       <w:r>
         <w:fldChar w:fldCharType="begin"/>
@@ -3213,12 +2983,12 @@
           <w:numId w:val="11"/>
         </w:numPr>
       </w:pPr>
-      <w:bookmarkStart w:id="14" w:name="_Ref_sec_m_estimation"/>
+      <w:bookmarkStart w:id="24" w:name="_Ref_sec_m_estimation"/>
       <w:r>
         <w:lastRenderedPageBreak/>
         <w:t>Estimation and Inference</w:t>
       </w:r>
-      <w:bookmarkEnd w:id="14"/>
+      <w:bookmarkEnd w:id="24"/>
     </w:p>
     <w:p>
       <w:r>
@@ -3234,11 +3004,11 @@
         </w:numPr>
         <w:ind w:hanging="540"/>
       </w:pPr>
-      <w:bookmarkStart w:id="15" w:name="_Ref_sec_m_robustness"/>
+      <w:bookmarkStart w:id="25" w:name="_Ref_sec_m_robustness"/>
       <w:r>
         <w:t>Robustness and Diagnostic Checks</w:t>
       </w:r>
-      <w:bookmarkEnd w:id="15"/>
+      <w:bookmarkEnd w:id="25"/>
     </w:p>
     <w:p>
       <w:r>
@@ -3467,28 +3237,12 @@
     </w:p>
     <w:p>
       <w:r>
-        <w:t xml:space="preserve">Four additional checks are reported in the Supplementary Information. Poisson pseudo-maximum-likelihood models fitted to raw counts with a population offset address the zero-inflation that a </w:t>
-      </w:r>
-      <w:proofErr w:type="gramStart"/>
-      <w:r>
-        <w:t>log(</w:t>
-      </w:r>
-      <w:proofErr w:type="gramEnd"/>
-      <w:r>
-        <w:t>1 + rate) transformation handles only implicitly. Population-weighted estimates test whether unweighted ZCTA regressions are driven by small areas. A spatial error model with eight-nearest-neighbor weights addresses spatially structured omitted variables, which Conley standard errors correct for in inference but not in the conditional mean. Finally, because six outcomes are estimated across a series of specifications, individual p-values close to conventional thresholds should not be read in isolation; the specification curve and the Oster bounds are reported precisely so that robustness does not rest on any single test.</w:t>
+        <w:t>Four additional checks are reported in the Supplementary Information. Poisson pseudo-maximum-likelihood models fitted to raw counts with a population offset address the zero-inflation that a log(1 + rate) transformation handles only implicitly. Population-weighted estimates test whether unweighted ZCTA regressions are driven by small areas. A spatial error model with eight-nearest-neighbor weights addresses spatially structured omitted variables, which Conley standard errors correct for in inference but not in the conditional mean. Finally, because six outcomes are estimated across a series of specifications, individual p-values close to conventional thresholds should not be read in isolation; the specification curve and the Oster bounds are reported precisely so that robustness does not rest on any single test.</w:t>
       </w:r>
     </w:p>
     <w:p>
       <w:r>
-        <w:t xml:space="preserve">The per-capita energy affordability gap is the California Energy Commission affordability-gap series divided by ZCTA population, entered as </w:t>
-      </w:r>
-      <w:proofErr w:type="gramStart"/>
-      <w:r>
-        <w:t>log(</w:t>
-      </w:r>
-      <w:proofErr w:type="gramEnd"/>
-      <w:r>
-        <w:t xml:space="preserve">1 + gap per capita). Its distribution is severely skewed — median about $75, maximum above $236,000, with the top 100 ZCTAs accounting for 92 percent of the statewide total — which we attribute to error in the source series. Main-text affordability estimates exclude the 134 ZCTAs above $1,000 per capita; full-sample estimates are in Supplementary Table S12. Mean energy burden in the matched sample is </w:t>
+        <w:t xml:space="preserve">The per-capita energy affordability gap is the California Energy Commission affordability-gap series divided by ZCTA population, entered as log(1 + gap per capita). Its distribution is severely skewed — median about $75, maximum above $236,000, with the top 100 ZCTAs accounting for 92 percent of the statewide total — which we attribute to error in the source series. Main-text affordability estimates exclude the 134 ZCTAs above $1,000 per capita; full-sample estimates are in Supplementary Table S12. Mean energy burden in the matched sample is </w:t>
       </w:r>
       <w:r>
         <w:lastRenderedPageBreak/>
@@ -3505,11 +3259,11 @@
         <w:ind w:hanging="540"/>
         <w:jc w:val="both"/>
       </w:pPr>
-      <w:bookmarkStart w:id="16" w:name="_Ref_sec_limitations"/>
+      <w:bookmarkStart w:id="26" w:name="_Ref_sec_limitations"/>
       <w:r>
         <w:t>Methodological Limitations</w:t>
       </w:r>
-      <w:bookmarkEnd w:id="16"/>
+      <w:bookmarkEnd w:id="26"/>
     </w:p>
     <w:p>
       <w:r>
@@ -3558,15 +3312,7 @@
     </w:p>
     <w:p>
       <w:r>
-        <w:t xml:space="preserve">The harmonized ZCTA analysis dataset is deposited at </w:t>
-      </w:r>
-      <w:proofErr w:type="spellStart"/>
-      <w:r>
-        <w:t>Zenodo</w:t>
-      </w:r>
-      <w:proofErr w:type="spellEnd"/>
-      <w:r>
-        <w:t xml:space="preserve"> under CC-BY-4.0 [DOI to be inserted before submission]. All underlying sources are public and are listed in the Supplementary Information.</w:t>
+        <w:t>The harmonized ZCTA analysis dataset is deposited at Zenodo under CC-BY-4.0 [DOI to be inserted before submission]. All underlying sources are public and are listed in the Supplementary Information.</w:t>
       </w:r>
     </w:p>
     <w:p>
@@ -3657,39 +3403,7 @@
               <w:rFonts w:eastAsia="Times New Roman" w:cs="Times New Roman"/>
               <w:color w:val="000000"/>
             </w:rPr>
-            <w:t>[</w:t>
-          </w:r>
-          <w:proofErr w:type="gramStart"/>
-          <w:r>
-            <w:rPr>
-              <w:rFonts w:eastAsia="Times New Roman" w:cs="Times New Roman"/>
-              <w:color w:val="000000"/>
-            </w:rPr>
-            <w:t>1]B.</w:t>
-          </w:r>
-          <w:proofErr w:type="gramEnd"/>
-          <w:r>
-            <w:rPr>
-              <w:rFonts w:eastAsia="Times New Roman" w:cs="Times New Roman"/>
-              <w:color w:val="000000"/>
-            </w:rPr>
-            <w:t xml:space="preserve"> R. Lukanov and E. M. Krieger, “Distributed solar and environmental justice: Exploring the demographic and socio-economic trends of residential PV adoption in California,” Energy Policy, vol. 134, 2019, </w:t>
-          </w:r>
-          <w:proofErr w:type="gramStart"/>
-          <w:r>
-            <w:rPr>
-              <w:rFonts w:eastAsia="Times New Roman" w:cs="Times New Roman"/>
-              <w:color w:val="000000"/>
-            </w:rPr>
-            <w:t>doi:10.1016/j.enpol</w:t>
-          </w:r>
-          <w:proofErr w:type="gramEnd"/>
-          <w:r>
-            <w:rPr>
-              <w:rFonts w:eastAsia="Times New Roman" w:cs="Times New Roman"/>
-              <w:color w:val="000000"/>
-            </w:rPr>
-            <w:t>.2019.110935.</w:t>
+            <w:t>[1]B. R. Lukanov and E. M. Krieger, “Distributed solar and environmental justice: Exploring the demographic and socio-economic trends of residential PV adoption in California,” Energy Policy, vol. 134, 2019, doi:10.1016/j.enpol.2019.110935.</w:t>
           </w:r>
           <w:r>
             <w:rPr>
@@ -3698,7 +3412,7 @@
             </w:rPr>
             <w:tab/>
           </w:r>
-          <w:hyperlink r:id="rId12" w:history="1"/>
+          <w:hyperlink r:id="rId16" w:history="1"/>
         </w:p>
         <w:p>
           <w:pPr>
@@ -3711,45 +3425,13 @@
               <w:color w:val="000000"/>
             </w:rPr>
           </w:pPr>
-          <w:bookmarkStart w:id="17" w:name="_Ref_bib2"/>
+          <w:bookmarkStart w:id="27" w:name="_Ref_bib2"/>
           <w:r>
             <w:rPr>
               <w:rFonts w:eastAsia="Times New Roman" w:cs="Times New Roman"/>
               <w:color w:val="000000"/>
             </w:rPr>
-            <w:t>[</w:t>
-          </w:r>
-          <w:proofErr w:type="gramStart"/>
-          <w:r>
-            <w:rPr>
-              <w:rFonts w:eastAsia="Times New Roman" w:cs="Times New Roman"/>
-              <w:color w:val="000000"/>
-            </w:rPr>
-            <w:t>2]D.</w:t>
-          </w:r>
-          <w:proofErr w:type="gramEnd"/>
-          <w:r>
-            <w:rPr>
-              <w:rFonts w:eastAsia="Times New Roman" w:cs="Times New Roman"/>
-              <w:color w:val="000000"/>
-            </w:rPr>
-            <w:t xml:space="preserve"> A. Sunter, S. Castellanos, and D. M. </w:t>
-          </w:r>
-          <w:proofErr w:type="spellStart"/>
-          <w:r>
-            <w:rPr>
-              <w:rFonts w:eastAsia="Times New Roman" w:cs="Times New Roman"/>
-              <w:color w:val="000000"/>
-            </w:rPr>
-            <w:t>Kammen</w:t>
-          </w:r>
-          <w:proofErr w:type="spellEnd"/>
-          <w:r>
-            <w:rPr>
-              <w:rFonts w:eastAsia="Times New Roman" w:cs="Times New Roman"/>
-              <w:color w:val="000000"/>
-            </w:rPr>
-            <w:t>, “Disparities in rooftop photovoltaics deployment in the United States by race and ethnicity,” Nat. Sustain., vol. 2, no. 1, pp. 71–76, Jan. 2019, doi:10.1038/s41893-018-0204-z.</w:t>
+            <w:t>[2]D. A. Sunter, S. Castellanos, and D. M. Kammen, “Disparities in rooftop photovoltaics deployment in the United States by race and ethnicity,” Nat. Sustain., vol. 2, no. 1, pp. 71–76, Jan. 2019, doi:10.1038/s41893-018-0204-z.</w:t>
           </w:r>
           <w:r>
             <w:rPr>
@@ -3758,8 +3440,8 @@
             </w:rPr>
             <w:tab/>
           </w:r>
-          <w:hyperlink r:id="rId13" w:history="1"/>
-          <w:bookmarkEnd w:id="17"/>
+          <w:hyperlink r:id="rId17" w:history="1"/>
+          <w:bookmarkEnd w:id="27"/>
         </w:p>
         <w:p>
           <w:pPr>
@@ -3772,61 +3454,13 @@
               <w:color w:val="000000"/>
             </w:rPr>
           </w:pPr>
-          <w:bookmarkStart w:id="18" w:name="_Ref_bib3"/>
+          <w:bookmarkStart w:id="28" w:name="_Ref_bib3"/>
           <w:r>
             <w:rPr>
               <w:rFonts w:eastAsia="Times New Roman" w:cs="Times New Roman"/>
               <w:color w:val="000000"/>
             </w:rPr>
-            <w:t>[</w:t>
-          </w:r>
-          <w:proofErr w:type="gramStart"/>
-          <w:r>
-            <w:rPr>
-              <w:rFonts w:eastAsia="Times New Roman" w:cs="Times New Roman"/>
-              <w:color w:val="000000"/>
-            </w:rPr>
-            <w:t>3]L.</w:t>
-          </w:r>
-          <w:proofErr w:type="gramEnd"/>
-          <w:r>
-            <w:rPr>
-              <w:rFonts w:eastAsia="Times New Roman" w:cs="Times New Roman"/>
-              <w:color w:val="000000"/>
-            </w:rPr>
-            <w:t xml:space="preserve"> </w:t>
-          </w:r>
-          <w:proofErr w:type="spellStart"/>
-          <w:r>
-            <w:rPr>
-              <w:rFonts w:eastAsia="Times New Roman" w:cs="Times New Roman"/>
-              <w:color w:val="000000"/>
-            </w:rPr>
-            <w:t>Kurdgelashvili</w:t>
-          </w:r>
-          <w:proofErr w:type="spellEnd"/>
-          <w:r>
-            <w:rPr>
-              <w:rFonts w:eastAsia="Times New Roman" w:cs="Times New Roman"/>
-              <w:color w:val="000000"/>
-            </w:rPr>
-            <w:t xml:space="preserve">, C. H. Shih, F. Yang, and M. Garg, “An empirical analysis of county-level residential PV adoption in California,” Technol. Forecast. Soc. Change, vol. 139, 2019, </w:t>
-          </w:r>
-          <w:proofErr w:type="gramStart"/>
-          <w:r>
-            <w:rPr>
-              <w:rFonts w:eastAsia="Times New Roman" w:cs="Times New Roman"/>
-              <w:color w:val="000000"/>
-            </w:rPr>
-            <w:t>doi:10.1016/j.techfore</w:t>
-          </w:r>
-          <w:proofErr w:type="gramEnd"/>
-          <w:r>
-            <w:rPr>
-              <w:rFonts w:eastAsia="Times New Roman" w:cs="Times New Roman"/>
-              <w:color w:val="000000"/>
-            </w:rPr>
-            <w:t>.2018.11.021.</w:t>
+            <w:t>[3]L. Kurdgelashvili, C. H. Shih, F. Yang, and M. Garg, “An empirical analysis of county-level residential PV adoption in California,” Technol. Forecast. Soc. Change, vol. 139, 2019, doi:10.1016/j.techfore.2018.11.021.</w:t>
           </w:r>
           <w:r>
             <w:rPr>
@@ -3835,8 +3469,8 @@
             </w:rPr>
             <w:tab/>
           </w:r>
-          <w:hyperlink r:id="rId14" w:history="1"/>
-          <w:bookmarkEnd w:id="18"/>
+          <w:hyperlink r:id="rId18" w:history="1"/>
+          <w:bookmarkEnd w:id="28"/>
         </w:p>
         <w:p>
           <w:pPr>
@@ -3849,45 +3483,13 @@
               <w:color w:val="000000"/>
             </w:rPr>
           </w:pPr>
-          <w:bookmarkStart w:id="19" w:name="_Ref_bib4"/>
+          <w:bookmarkStart w:id="29" w:name="_Ref_bib4"/>
           <w:r>
             <w:rPr>
               <w:rFonts w:eastAsia="Times New Roman" w:cs="Times New Roman"/>
               <w:color w:val="000000"/>
             </w:rPr>
-            <w:t>[</w:t>
-          </w:r>
-          <w:proofErr w:type="gramStart"/>
-          <w:r>
-            <w:rPr>
-              <w:rFonts w:eastAsia="Times New Roman" w:cs="Times New Roman"/>
-              <w:color w:val="000000"/>
-            </w:rPr>
-            <w:t>4]T.</w:t>
-          </w:r>
-          <w:proofErr w:type="gramEnd"/>
-          <w:r>
-            <w:rPr>
-              <w:rFonts w:eastAsia="Times New Roman" w:cs="Times New Roman"/>
-              <w:color w:val="000000"/>
-            </w:rPr>
-            <w:t xml:space="preserve"> G. Reames, “Distributional disparities in residential rooftop solar potential and penetration in four cities in the United States,” Energy Res. Soc. Sci., vol. 69, p. 101612, Nov. 2020, </w:t>
-          </w:r>
-          <w:proofErr w:type="gramStart"/>
-          <w:r>
-            <w:rPr>
-              <w:rFonts w:eastAsia="Times New Roman" w:cs="Times New Roman"/>
-              <w:color w:val="000000"/>
-            </w:rPr>
-            <w:t>doi:10.1016/J.ERSS</w:t>
-          </w:r>
-          <w:proofErr w:type="gramEnd"/>
-          <w:r>
-            <w:rPr>
-              <w:rFonts w:eastAsia="Times New Roman" w:cs="Times New Roman"/>
-              <w:color w:val="000000"/>
-            </w:rPr>
-            <w:t>.2020.101612.</w:t>
+            <w:t>[4]T. G. Reames, “Distributional disparities in residential rooftop solar potential and penetration in four cities in the United States,” Energy Res. Soc. Sci., vol. 69, p. 101612, Nov. 2020, doi:10.1016/J.ERSS.2020.101612.</w:t>
           </w:r>
           <w:r>
             <w:rPr>
@@ -3896,8 +3498,8 @@
             </w:rPr>
             <w:tab/>
           </w:r>
-          <w:hyperlink r:id="rId15" w:history="1"/>
-          <w:bookmarkEnd w:id="19"/>
+          <w:hyperlink r:id="rId19" w:history="1"/>
+          <w:bookmarkEnd w:id="29"/>
         </w:p>
         <w:p>
           <w:pPr>
@@ -3910,61 +3512,13 @@
               <w:color w:val="000000"/>
             </w:rPr>
           </w:pPr>
-          <w:bookmarkStart w:id="20" w:name="_Ref_bib5"/>
+          <w:bookmarkStart w:id="30" w:name="_Ref_bib5"/>
           <w:r>
             <w:rPr>
               <w:rFonts w:eastAsia="Times New Roman" w:cs="Times New Roman"/>
               <w:color w:val="000000"/>
             </w:rPr>
-            <w:t>[</w:t>
-          </w:r>
-          <w:proofErr w:type="gramStart"/>
-          <w:r>
-            <w:rPr>
-              <w:rFonts w:eastAsia="Times New Roman" w:cs="Times New Roman"/>
-              <w:color w:val="000000"/>
-            </w:rPr>
-            <w:t>5]N.</w:t>
-          </w:r>
-          <w:proofErr w:type="gramEnd"/>
-          <w:r>
-            <w:rPr>
-              <w:rFonts w:eastAsia="Times New Roman" w:cs="Times New Roman"/>
-              <w:color w:val="000000"/>
-            </w:rPr>
-            <w:t xml:space="preserve"> R. </w:t>
-          </w:r>
-          <w:proofErr w:type="spellStart"/>
-          <w:r>
-            <w:rPr>
-              <w:rFonts w:eastAsia="Times New Roman" w:cs="Times New Roman"/>
-              <w:color w:val="000000"/>
-            </w:rPr>
-            <w:t>Darghouth</w:t>
-          </w:r>
-          <w:proofErr w:type="spellEnd"/>
-          <w:r>
-            <w:rPr>
-              <w:rFonts w:eastAsia="Times New Roman" w:cs="Times New Roman"/>
-              <w:color w:val="000000"/>
-            </w:rPr>
-            <w:t xml:space="preserve">, E. O’Shaughnessy, S. Forrester, and G. </w:t>
-          </w:r>
-          <w:proofErr w:type="spellStart"/>
-          <w:r>
-            <w:rPr>
-              <w:rFonts w:eastAsia="Times New Roman" w:cs="Times New Roman"/>
-              <w:color w:val="000000"/>
-            </w:rPr>
-            <w:t>Barbose</w:t>
-          </w:r>
-          <w:proofErr w:type="spellEnd"/>
-          <w:r>
-            <w:rPr>
-              <w:rFonts w:eastAsia="Times New Roman" w:cs="Times New Roman"/>
-              <w:color w:val="000000"/>
-            </w:rPr>
-            <w:t>, “Characterizing local rooftop solar adoption inequity in the US,” Environmental Research Letters, vol. 17, no. 3, p. 034028, Feb. 2022, doi:10.1088/1748-9326/AC4FDC.</w:t>
+            <w:t>[5]N. R. Darghouth, E. O’Shaughnessy, S. Forrester, and G. Barbose, “Characterizing local rooftop solar adoption inequity in the US,” Environmental Research Letters, vol. 17, no. 3, p. 034028, Feb. 2022, doi:10.1088/1748-9326/AC4FDC.</w:t>
           </w:r>
           <w:r>
             <w:rPr>
@@ -3973,8 +3527,8 @@
             </w:rPr>
             <w:tab/>
           </w:r>
-          <w:hyperlink r:id="rId16" w:history="1"/>
-          <w:bookmarkEnd w:id="20"/>
+          <w:hyperlink r:id="rId20" w:history="1"/>
+          <w:bookmarkEnd w:id="30"/>
         </w:p>
         <w:p>
           <w:pPr>
@@ -3987,48 +3541,14 @@
               <w:color w:val="000000"/>
             </w:rPr>
           </w:pPr>
-          <w:bookmarkStart w:id="21" w:name="_Ref_bib6"/>
+          <w:bookmarkStart w:id="31" w:name="_Ref_bib6"/>
           <w:r>
             <w:rPr>
               <w:rFonts w:eastAsia="Times New Roman" w:cs="Times New Roman"/>
               <w:color w:val="000000"/>
             </w:rPr>
-            <w:t>[</w:t>
+            <w:t>[6]C. Sigrist, A. Lechowicz, J. Champ, N. Bashir, and M. Hajiesmaili, “Lost in Siting: The Hidden Carbon Cost of Inequitable Residential Solar Installations,” Jan. 2025, [Online]. Available:http://arxiv.org/abs/2501.13868</w:t>
           </w:r>
-          <w:proofErr w:type="gramStart"/>
-          <w:r>
-            <w:rPr>
-              <w:rFonts w:eastAsia="Times New Roman" w:cs="Times New Roman"/>
-              <w:color w:val="000000"/>
-            </w:rPr>
-            <w:t>6]C.</w:t>
-          </w:r>
-          <w:proofErr w:type="gramEnd"/>
-          <w:r>
-            <w:rPr>
-              <w:rFonts w:eastAsia="Times New Roman" w:cs="Times New Roman"/>
-              <w:color w:val="000000"/>
-            </w:rPr>
-            <w:t xml:space="preserve"> Sigrist, A. Lechowicz, J. Champ, N. Bashir, and M. Hajiesmaili, “Lost in Siting: The Hidden Carbon Cost of Inequitable Residential Solar Installations,” Jan. 2025, [Online]. </w:t>
-          </w:r>
-          <w:proofErr w:type="spellStart"/>
-          <w:proofErr w:type="gramStart"/>
-          <w:r>
-            <w:rPr>
-              <w:rFonts w:eastAsia="Times New Roman" w:cs="Times New Roman"/>
-              <w:color w:val="000000"/>
-            </w:rPr>
-            <w:t>Available:http</w:t>
-          </w:r>
-          <w:proofErr w:type="spellEnd"/>
-          <w:r>
-            <w:rPr>
-              <w:rFonts w:eastAsia="Times New Roman" w:cs="Times New Roman"/>
-              <w:color w:val="000000"/>
-            </w:rPr>
-            <w:t>://arxiv.org/abs/2501.13868</w:t>
-          </w:r>
-          <w:proofErr w:type="gramEnd"/>
           <w:r>
             <w:rPr>
               <w:rFonts w:eastAsia="Times New Roman" w:cs="Times New Roman"/>
@@ -4036,8 +3556,8 @@
             </w:rPr>
             <w:tab/>
           </w:r>
-          <w:hyperlink r:id="rId17" w:history="1"/>
-          <w:bookmarkEnd w:id="21"/>
+          <w:hyperlink r:id="rId21" w:history="1"/>
+          <w:bookmarkEnd w:id="31"/>
         </w:p>
         <w:p>
           <w:pPr>
@@ -4050,29 +3570,13 @@
               <w:color w:val="000000"/>
             </w:rPr>
           </w:pPr>
-          <w:bookmarkStart w:id="22" w:name="_Ref_bib7"/>
+          <w:bookmarkStart w:id="32" w:name="_Ref_bib7"/>
           <w:r>
             <w:rPr>
               <w:rFonts w:eastAsia="Times New Roman" w:cs="Times New Roman"/>
               <w:color w:val="000000"/>
             </w:rPr>
-            <w:t>[</w:t>
-          </w:r>
-          <w:proofErr w:type="gramStart"/>
-          <w:r>
-            <w:rPr>
-              <w:rFonts w:eastAsia="Times New Roman" w:cs="Times New Roman"/>
-              <w:color w:val="000000"/>
-            </w:rPr>
-            <w:t>7]A.</w:t>
-          </w:r>
-          <w:proofErr w:type="gramEnd"/>
-          <w:r>
-            <w:rPr>
-              <w:rFonts w:eastAsia="Times New Roman" w:cs="Times New Roman"/>
-              <w:color w:val="000000"/>
-            </w:rPr>
-            <w:t xml:space="preserve"> Drehobl, L. Ross, R. Ayala, A. Zaman, and J. Amann, “How high are household energy burdens? An assessment of national and metropolitan energy burden across the United States,” American Council for an Energy-Efficient Economy, Report U2006, Sep. 2020.</w:t>
+            <w:t>[7]A. Drehobl, L. Ross, R. Ayala, A. Zaman, and J. Amann, “How high are household energy burdens? An assessment of national and metropolitan energy burden across the United States,” American Council for an Energy-Efficient Economy, Report U2006, Sep. 2020.</w:t>
           </w:r>
           <w:r>
             <w:rPr>
@@ -4081,7 +3585,7 @@
             </w:rPr>
             <w:tab/>
           </w:r>
-          <w:bookmarkEnd w:id="22"/>
+          <w:bookmarkEnd w:id="32"/>
         </w:p>
         <w:p>
           <w:pPr>
@@ -4094,39 +3598,14 @@
               <w:color w:val="000000"/>
             </w:rPr>
           </w:pPr>
-          <w:bookmarkStart w:id="23" w:name="_Ref_bib8"/>
+          <w:bookmarkStart w:id="33" w:name="_Ref_bib8"/>
           <w:r>
             <w:rPr>
               <w:rFonts w:eastAsia="Times New Roman" w:cs="Times New Roman"/>
               <w:color w:val="000000"/>
             </w:rPr>
-            <w:t>[</w:t>
+            <w:t>[8]The Greenlining Institute, “Demystifying Equity in California’s Energy Grid Transition,” Jul. 25, 2024. [Online]. Available:https://greenlining.org/2024/demystifying-equity-in-californias-energy-grid-transition/</w:t>
           </w:r>
-          <w:proofErr w:type="gramStart"/>
-          <w:r>
-            <w:rPr>
-              <w:rFonts w:eastAsia="Times New Roman" w:cs="Times New Roman"/>
-              <w:color w:val="000000"/>
-            </w:rPr>
-            <w:t>8]The</w:t>
-          </w:r>
-          <w:proofErr w:type="gramEnd"/>
-          <w:r>
-            <w:rPr>
-              <w:rFonts w:eastAsia="Times New Roman" w:cs="Times New Roman"/>
-              <w:color w:val="000000"/>
-            </w:rPr>
-            <w:t xml:space="preserve"> Greenlining Institute, “Demystifying Equity in California’s Energy Grid Transition,” Jul. 25, 2024. [Online]. </w:t>
-          </w:r>
-          <w:proofErr w:type="gramStart"/>
-          <w:r>
-            <w:rPr>
-              <w:rFonts w:eastAsia="Times New Roman" w:cs="Times New Roman"/>
-              <w:color w:val="000000"/>
-            </w:rPr>
-            <w:t>Available:https://greenlining.org/2024/demystifying-equity-in-californias-energy-grid-transition/</w:t>
-          </w:r>
-          <w:proofErr w:type="gramEnd"/>
           <w:r>
             <w:rPr>
               <w:rFonts w:eastAsia="Times New Roman" w:cs="Times New Roman"/>
@@ -4134,8 +3613,8 @@
             </w:rPr>
             <w:tab/>
           </w:r>
-          <w:hyperlink r:id="rId18" w:history="1"/>
-          <w:bookmarkEnd w:id="23"/>
+          <w:hyperlink r:id="rId22" w:history="1"/>
+          <w:bookmarkEnd w:id="33"/>
         </w:p>
         <w:p>
           <w:pPr>
@@ -4148,30 +3627,14 @@
               <w:color w:val="000000"/>
             </w:rPr>
           </w:pPr>
-          <w:bookmarkStart w:id="24" w:name="_Ref_bib9"/>
+          <w:bookmarkStart w:id="34" w:name="_Ref_bib9"/>
           <w:r>
             <w:rPr>
               <w:rFonts w:eastAsia="Times New Roman" w:cs="Times New Roman"/>
               <w:color w:val="000000"/>
             </w:rPr>
             <w:lastRenderedPageBreak/>
-            <w:t>[</w:t>
-          </w:r>
-          <w:proofErr w:type="gramStart"/>
-          <w:r>
-            <w:rPr>
-              <w:rFonts w:eastAsia="Times New Roman" w:cs="Times New Roman"/>
-              <w:color w:val="000000"/>
-            </w:rPr>
-            <w:t>9]T.</w:t>
-          </w:r>
-          <w:proofErr w:type="gramEnd"/>
-          <w:r>
-            <w:rPr>
-              <w:rFonts w:eastAsia="Times New Roman" w:cs="Times New Roman"/>
-              <w:color w:val="000000"/>
-            </w:rPr>
-            <w:t xml:space="preserve"> Light, E. McIntosh, and O. Stephenson, “Advancing Equity in Access to Distributed Energy Resources in California,” Journal of Science Policy &amp; Governance, 2022, doi:10.38126/jspg200106.</w:t>
+            <w:t>[9]T. Light, E. McIntosh, and O. Stephenson, “Advancing Equity in Access to Distributed Energy Resources in California,” Journal of Science Policy &amp; Governance, 2022, doi:10.38126/jspg200106.</w:t>
           </w:r>
           <w:r>
             <w:rPr>
@@ -4180,8 +3643,8 @@
             </w:rPr>
             <w:tab/>
           </w:r>
-          <w:hyperlink r:id="rId19" w:history="1"/>
-          <w:bookmarkEnd w:id="24"/>
+          <w:hyperlink r:id="rId23" w:history="1"/>
+          <w:bookmarkEnd w:id="34"/>
         </w:p>
         <w:p>
           <w:pPr>
@@ -4194,61 +3657,13 @@
               <w:color w:val="000000"/>
             </w:rPr>
           </w:pPr>
-          <w:bookmarkStart w:id="25" w:name="_Ref_bib10"/>
+          <w:bookmarkStart w:id="35" w:name="_Ref_bib10"/>
           <w:r>
             <w:rPr>
               <w:rFonts w:eastAsia="Times New Roman" w:cs="Times New Roman"/>
               <w:color w:val="000000"/>
             </w:rPr>
-            <w:t>[</w:t>
-          </w:r>
-          <w:proofErr w:type="gramStart"/>
-          <w:r>
-            <w:rPr>
-              <w:rFonts w:eastAsia="Times New Roman" w:cs="Times New Roman"/>
-              <w:color w:val="000000"/>
-            </w:rPr>
-            <w:t>10]S.</w:t>
-          </w:r>
-          <w:proofErr w:type="gramEnd"/>
-          <w:r>
-            <w:rPr>
-              <w:rFonts w:eastAsia="Times New Roman" w:cs="Times New Roman"/>
-              <w:color w:val="000000"/>
-            </w:rPr>
-            <w:t xml:space="preserve"> P. Forrester, C. C. </w:t>
-          </w:r>
-          <w:proofErr w:type="spellStart"/>
-          <w:r>
-            <w:rPr>
-              <w:rFonts w:eastAsia="Times New Roman" w:cs="Times New Roman"/>
-              <w:color w:val="000000"/>
-            </w:rPr>
-            <w:t>Montañés</w:t>
-          </w:r>
-          <w:proofErr w:type="spellEnd"/>
-          <w:r>
-            <w:rPr>
-              <w:rFonts w:eastAsia="Times New Roman" w:cs="Times New Roman"/>
-              <w:color w:val="000000"/>
-            </w:rPr>
-            <w:t xml:space="preserve">, E. O’Shaughnessy, and G. </w:t>
-          </w:r>
-          <w:proofErr w:type="spellStart"/>
-          <w:r>
-            <w:rPr>
-              <w:rFonts w:eastAsia="Times New Roman" w:cs="Times New Roman"/>
-              <w:color w:val="000000"/>
-            </w:rPr>
-            <w:t>Barbose</w:t>
-          </w:r>
-          <w:proofErr w:type="spellEnd"/>
-          <w:r>
-            <w:rPr>
-              <w:rFonts w:eastAsia="Times New Roman" w:cs="Times New Roman"/>
-              <w:color w:val="000000"/>
-            </w:rPr>
-            <w:t>, “Modeling the potential effects of rooftop solar on household energy burden in the United States,” Nature Communications 2024 15:1, vol. 15, no. 1, pp. 4676-, Jun. 2024, doi:10.1038/s41467-024-48967-x.</w:t>
+            <w:t>[10]S. P. Forrester, C. C. Montañés, E. O’Shaughnessy, and G. Barbose, “Modeling the potential effects of rooftop solar on household energy burden in the United States,” Nature Communications 2024 15:1, vol. 15, no. 1, pp. 4676-, Jun. 2024, doi:10.1038/s41467-024-48967-x.</w:t>
           </w:r>
           <w:r>
             <w:rPr>
@@ -4257,8 +3672,8 @@
             </w:rPr>
             <w:tab/>
           </w:r>
-          <w:hyperlink r:id="rId20" w:history="1"/>
-          <w:bookmarkEnd w:id="25"/>
+          <w:hyperlink r:id="rId24" w:history="1"/>
+          <w:bookmarkEnd w:id="35"/>
         </w:p>
         <w:p>
           <w:pPr>
@@ -4271,29 +3686,13 @@
               <w:color w:val="000000"/>
             </w:rPr>
           </w:pPr>
-          <w:bookmarkStart w:id="26" w:name="_Ref_bib11"/>
+          <w:bookmarkStart w:id="36" w:name="_Ref_bib11"/>
           <w:r>
             <w:rPr>
               <w:rFonts w:eastAsia="Times New Roman" w:cs="Times New Roman"/>
               <w:color w:val="000000"/>
             </w:rPr>
-            <w:t>[</w:t>
-          </w:r>
-          <w:proofErr w:type="gramStart"/>
-          <w:r>
-            <w:rPr>
-              <w:rFonts w:eastAsia="Times New Roman" w:cs="Times New Roman"/>
-              <w:color w:val="000000"/>
-            </w:rPr>
-            <w:t>11]A.</w:t>
-          </w:r>
-          <w:proofErr w:type="gramEnd"/>
-          <w:r>
-            <w:rPr>
-              <w:rFonts w:eastAsia="Times New Roman" w:cs="Times New Roman"/>
-              <w:color w:val="000000"/>
-            </w:rPr>
-            <w:t xml:space="preserve"> M. Brockway, J. Conde, and D. Callaway, “Inequitable access to distributed energy resources due to grid infrastructure limits in California,” Nat. Energy, vol. 6, no. 9, 2021, doi:10.1038/s41560-021-00887-6.</w:t>
+            <w:t>[11]A. M. Brockway, J. Conde, and D. Callaway, “Inequitable access to distributed energy resources due to grid infrastructure limits in California,” Nat. Energy, vol. 6, no. 9, 2021, doi:10.1038/s41560-021-00887-6.</w:t>
           </w:r>
           <w:r>
             <w:rPr>
@@ -4302,8 +3701,8 @@
             </w:rPr>
             <w:tab/>
           </w:r>
-          <w:hyperlink r:id="rId21" w:history="1"/>
-          <w:bookmarkEnd w:id="26"/>
+          <w:hyperlink r:id="rId25" w:history="1"/>
+          <w:bookmarkEnd w:id="36"/>
         </w:p>
         <w:p>
           <w:pPr>
@@ -4316,64 +3715,14 @@
               <w:color w:val="000000"/>
             </w:rPr>
           </w:pPr>
-          <w:bookmarkStart w:id="27" w:name="_Ref_bib15"/>
+          <w:bookmarkStart w:id="37" w:name="_Ref_bib15"/>
           <w:r>
             <w:rPr>
               <w:rFonts w:eastAsia="Times New Roman" w:cs="Times New Roman"/>
               <w:color w:val="000000"/>
             </w:rPr>
-            <w:t>[</w:t>
+            <w:t>[12]B. Aydin, R. Holt, and M. Almassalkhi, “Fairness-aware Dynamic Hosting Capacity and the Impacts of Strategic Solar PV Curtailment,” Apr. 2025, [Online]. Available:http://arxiv.org/abs/2504.18905</w:t>
           </w:r>
-          <w:proofErr w:type="gramStart"/>
-          <w:r>
-            <w:rPr>
-              <w:rFonts w:eastAsia="Times New Roman" w:cs="Times New Roman"/>
-              <w:color w:val="000000"/>
-            </w:rPr>
-            <w:t>12]B.</w:t>
-          </w:r>
-          <w:proofErr w:type="gramEnd"/>
-          <w:r>
-            <w:rPr>
-              <w:rFonts w:eastAsia="Times New Roman" w:cs="Times New Roman"/>
-              <w:color w:val="000000"/>
-            </w:rPr>
-            <w:t xml:space="preserve"> Aydin, R. Holt, and M. </w:t>
-          </w:r>
-          <w:proofErr w:type="spellStart"/>
-          <w:r>
-            <w:rPr>
-              <w:rFonts w:eastAsia="Times New Roman" w:cs="Times New Roman"/>
-              <w:color w:val="000000"/>
-            </w:rPr>
-            <w:t>Almassalkhi</w:t>
-          </w:r>
-          <w:proofErr w:type="spellEnd"/>
-          <w:r>
-            <w:rPr>
-              <w:rFonts w:eastAsia="Times New Roman" w:cs="Times New Roman"/>
-              <w:color w:val="000000"/>
-            </w:rPr>
-            <w:t xml:space="preserve">, “Fairness-aware Dynamic Hosting Capacity and the Impacts of Strategic Solar PV Curtailment,” Apr. 2025, [Online]. </w:t>
-          </w:r>
-          <w:proofErr w:type="spellStart"/>
-          <w:proofErr w:type="gramStart"/>
-          <w:r>
-            <w:rPr>
-              <w:rFonts w:eastAsia="Times New Roman" w:cs="Times New Roman"/>
-              <w:color w:val="000000"/>
-            </w:rPr>
-            <w:t>Available:http</w:t>
-          </w:r>
-          <w:proofErr w:type="spellEnd"/>
-          <w:r>
-            <w:rPr>
-              <w:rFonts w:eastAsia="Times New Roman" w:cs="Times New Roman"/>
-              <w:color w:val="000000"/>
-            </w:rPr>
-            <w:t>://arxiv.org/abs/2504.18905</w:t>
-          </w:r>
-          <w:proofErr w:type="gramEnd"/>
           <w:r>
             <w:rPr>
               <w:rFonts w:eastAsia="Times New Roman" w:cs="Times New Roman"/>
@@ -4381,8 +3730,8 @@
             </w:rPr>
             <w:tab/>
           </w:r>
-          <w:hyperlink r:id="rId22" w:history="1"/>
-          <w:bookmarkEnd w:id="27"/>
+          <w:hyperlink r:id="rId26" w:history="1"/>
+          <w:bookmarkEnd w:id="37"/>
         </w:p>
         <w:p>
           <w:pPr>
@@ -4395,29 +3744,13 @@
               <w:color w:val="000000"/>
             </w:rPr>
           </w:pPr>
-          <w:bookmarkStart w:id="28" w:name="_Ref_bib16"/>
+          <w:bookmarkStart w:id="38" w:name="_Ref_bib16"/>
           <w:r>
             <w:rPr>
               <w:rFonts w:eastAsia="Times New Roman" w:cs="Times New Roman"/>
               <w:color w:val="000000"/>
             </w:rPr>
-            <w:t>[</w:t>
-          </w:r>
-          <w:proofErr w:type="gramStart"/>
-          <w:r>
-            <w:rPr>
-              <w:rFonts w:eastAsia="Times New Roman" w:cs="Times New Roman"/>
-              <w:color w:val="000000"/>
-            </w:rPr>
-            <w:t>13]U.S.</w:t>
-          </w:r>
-          <w:proofErr w:type="gramEnd"/>
-          <w:r>
-            <w:rPr>
-              <w:rFonts w:eastAsia="Times New Roman" w:cs="Times New Roman"/>
-              <w:color w:val="000000"/>
-            </w:rPr>
-            <w:t xml:space="preserve"> Department of Energy, “Distributed energy resource interconnection roadmap,” i2X initiative, 2023. [Online]. Available: https://www.energy.gov/eere/i2x</w:t>
+            <w:t>[13]U.S. Department of Energy, “Distributed energy resource interconnection roadmap,” i2X initiative, 2023. [Online]. Available: https://www.energy.gov/eere/i2x</w:t>
           </w:r>
           <w:r>
             <w:rPr>
@@ -4426,7 +3759,7 @@
             </w:rPr>
             <w:tab/>
           </w:r>
-          <w:bookmarkEnd w:id="28"/>
+          <w:bookmarkEnd w:id="38"/>
         </w:p>
         <w:p>
           <w:pPr>
@@ -4439,45 +3772,13 @@
               <w:color w:val="000000"/>
             </w:rPr>
           </w:pPr>
-          <w:bookmarkStart w:id="29" w:name="_Ref_bib17"/>
+          <w:bookmarkStart w:id="39" w:name="_Ref_bib17"/>
           <w:r>
             <w:rPr>
               <w:rFonts w:eastAsia="Times New Roman" w:cs="Times New Roman"/>
               <w:color w:val="000000"/>
             </w:rPr>
-            <w:t>[</w:t>
-          </w:r>
-          <w:proofErr w:type="gramStart"/>
-          <w:r>
-            <w:rPr>
-              <w:rFonts w:eastAsia="Times New Roman" w:cs="Times New Roman"/>
-              <w:color w:val="000000"/>
-            </w:rPr>
-            <w:t>14]B.</w:t>
-          </w:r>
-          <w:proofErr w:type="gramEnd"/>
-          <w:r>
-            <w:rPr>
-              <w:rFonts w:eastAsia="Times New Roman" w:cs="Times New Roman"/>
-              <w:color w:val="000000"/>
-            </w:rPr>
-            <w:t xml:space="preserve"> </w:t>
-          </w:r>
-          <w:proofErr w:type="spellStart"/>
-          <w:r>
-            <w:rPr>
-              <w:rFonts w:eastAsia="Times New Roman" w:cs="Times New Roman"/>
-              <w:color w:val="000000"/>
-            </w:rPr>
-            <w:t>Tarekegne</w:t>
-          </w:r>
-          <w:proofErr w:type="spellEnd"/>
-          <w:r>
-            <w:rPr>
-              <w:rFonts w:eastAsia="Times New Roman" w:cs="Times New Roman"/>
-              <w:color w:val="000000"/>
-            </w:rPr>
-            <w:t>, R. O’Neil, and J. Twitchell, “Energy Storage as an Equity Asset,” 2021. doi:10.1007/s40518-021-00184-6.</w:t>
+            <w:t>[14]B. Tarekegne, R. O’Neil, and J. Twitchell, “Energy Storage as an Equity Asset,” 2021. doi:10.1007/s40518-021-00184-6.</w:t>
           </w:r>
           <w:r>
             <w:rPr>
@@ -4486,8 +3787,8 @@
             </w:rPr>
             <w:tab/>
           </w:r>
-          <w:hyperlink r:id="rId23" w:history="1"/>
-          <w:bookmarkEnd w:id="29"/>
+          <w:hyperlink r:id="rId27" w:history="1"/>
+          <w:bookmarkEnd w:id="39"/>
         </w:p>
         <w:p>
           <w:pPr>
@@ -4500,61 +3801,13 @@
               <w:color w:val="000000"/>
             </w:rPr>
           </w:pPr>
-          <w:bookmarkStart w:id="30" w:name="_Ref_bib22"/>
+          <w:bookmarkStart w:id="40" w:name="_Ref_bib22"/>
           <w:r>
             <w:rPr>
               <w:rFonts w:eastAsia="Times New Roman" w:cs="Times New Roman"/>
               <w:color w:val="000000"/>
             </w:rPr>
-            <w:t>[</w:t>
-          </w:r>
-          <w:proofErr w:type="gramStart"/>
-          <w:r>
-            <w:rPr>
-              <w:rFonts w:eastAsia="Times New Roman" w:cs="Times New Roman"/>
-              <w:color w:val="000000"/>
-            </w:rPr>
-            <w:t>15]M.</w:t>
-          </w:r>
-          <w:proofErr w:type="gramEnd"/>
-          <w:r>
-            <w:rPr>
-              <w:rFonts w:eastAsia="Times New Roman" w:cs="Times New Roman"/>
-              <w:color w:val="000000"/>
-            </w:rPr>
-            <w:t xml:space="preserve"> Alipour, E. </w:t>
-          </w:r>
-          <w:proofErr w:type="spellStart"/>
-          <w:r>
-            <w:rPr>
-              <w:rFonts w:eastAsia="Times New Roman" w:cs="Times New Roman"/>
-              <w:color w:val="000000"/>
-            </w:rPr>
-            <w:t>Irannezhad</w:t>
-          </w:r>
-          <w:proofErr w:type="spellEnd"/>
-          <w:r>
-            <w:rPr>
-              <w:rFonts w:eastAsia="Times New Roman" w:cs="Times New Roman"/>
-              <w:color w:val="000000"/>
-            </w:rPr>
-            <w:t xml:space="preserve">, R. A. Stewart, and O. Sahin, “Exploring residential solar PV and battery energy storage adoption motivations and barriers in a mature PV market,” Renew. Energy, vol. 190, 2022, </w:t>
-          </w:r>
-          <w:proofErr w:type="gramStart"/>
-          <w:r>
-            <w:rPr>
-              <w:rFonts w:eastAsia="Times New Roman" w:cs="Times New Roman"/>
-              <w:color w:val="000000"/>
-            </w:rPr>
-            <w:t>doi:10.1016/j.renene</w:t>
-          </w:r>
-          <w:proofErr w:type="gramEnd"/>
-          <w:r>
-            <w:rPr>
-              <w:rFonts w:eastAsia="Times New Roman" w:cs="Times New Roman"/>
-              <w:color w:val="000000"/>
-            </w:rPr>
-            <w:t>.2022.03.040.</w:t>
+            <w:t>[15]M. Alipour, E. Irannezhad, R. A. Stewart, and O. Sahin, “Exploring residential solar PV and battery energy storage adoption motivations and barriers in a mature PV market,” Renew. Energy, vol. 190, 2022, doi:10.1016/j.renene.2022.03.040.</w:t>
           </w:r>
           <w:r>
             <w:rPr>
@@ -4563,8 +3816,8 @@
             </w:rPr>
             <w:tab/>
           </w:r>
-          <w:hyperlink r:id="rId24" w:history="1"/>
-          <w:bookmarkEnd w:id="30"/>
+          <w:hyperlink r:id="rId28" w:history="1"/>
+          <w:bookmarkEnd w:id="40"/>
         </w:p>
         <w:p>
           <w:pPr>
@@ -4577,29 +3830,13 @@
               <w:color w:val="000000"/>
             </w:rPr>
           </w:pPr>
-          <w:bookmarkStart w:id="31" w:name="_Ref_bib23"/>
+          <w:bookmarkStart w:id="41" w:name="_Ref_bib23"/>
           <w:r>
             <w:rPr>
               <w:rFonts w:eastAsia="Times New Roman" w:cs="Times New Roman"/>
               <w:color w:val="000000"/>
             </w:rPr>
-            <w:t>[</w:t>
-          </w:r>
-          <w:proofErr w:type="gramStart"/>
-          <w:r>
-            <w:rPr>
-              <w:rFonts w:eastAsia="Times New Roman" w:cs="Times New Roman"/>
-              <w:color w:val="000000"/>
-            </w:rPr>
-            <w:t>16]R.</w:t>
-          </w:r>
-          <w:proofErr w:type="gramEnd"/>
-          <w:r>
-            <w:rPr>
-              <w:rFonts w:eastAsia="Times New Roman" w:cs="Times New Roman"/>
-              <w:color w:val="000000"/>
-            </w:rPr>
-            <w:t xml:space="preserve"> Haider, Y. Xu, and W. Yang, “Towards closing the data gap: A project-driven distributed energy resource dataset for the U.S. Grid,” in e-Energy 2023 Companion - Proceedings of the 14th ACM International Conference on Future Energy Systems, 2023. doi:10.1145/3599733.3600250.</w:t>
+            <w:t>[16]R. Haider, Y. Xu, and W. Yang, “Towards closing the data gap: A project-driven distributed energy resource dataset for the U.S. Grid,” in e-Energy 2023 Companion - Proceedings of the 14th ACM International Conference on Future Energy Systems, 2023. doi:10.1145/3599733.3600250.</w:t>
           </w:r>
           <w:r>
             <w:rPr>
@@ -4608,8 +3845,8 @@
             </w:rPr>
             <w:tab/>
           </w:r>
-          <w:hyperlink r:id="rId25" w:history="1"/>
-          <w:bookmarkEnd w:id="31"/>
+          <w:hyperlink r:id="rId29" w:history="1"/>
+          <w:bookmarkEnd w:id="41"/>
         </w:p>
         <w:p>
           <w:pPr>
@@ -4622,29 +3859,13 @@
               <w:color w:val="000000"/>
             </w:rPr>
           </w:pPr>
-          <w:bookmarkStart w:id="32" w:name="_Ref_bib24"/>
+          <w:bookmarkStart w:id="42" w:name="_Ref_bib24"/>
           <w:r>
             <w:rPr>
               <w:rFonts w:eastAsia="Times New Roman" w:cs="Times New Roman"/>
               <w:color w:val="000000"/>
             </w:rPr>
-            <w:t>[</w:t>
-          </w:r>
-          <w:proofErr w:type="gramStart"/>
-          <w:r>
-            <w:rPr>
-              <w:rFonts w:eastAsia="Times New Roman" w:cs="Times New Roman"/>
-              <w:color w:val="000000"/>
-            </w:rPr>
-            <w:t>17]L.</w:t>
-          </w:r>
-          <w:proofErr w:type="gramEnd"/>
-          <w:r>
-            <w:rPr>
-              <w:rFonts w:eastAsia="Times New Roman" w:cs="Times New Roman"/>
-              <w:color w:val="000000"/>
-            </w:rPr>
-            <w:t xml:space="preserve"> Ge, T. Du, C. Li, Y. Li, J. Yan, and M. U. Rafiq, “Virtual Collection for Distributed Photovoltaic Data: Challenges, Methodologies, and Applications,” 2022. doi:10.3390/en15238783.</w:t>
+            <w:t>[17]L. Ge, T. Du, C. Li, Y. Li, J. Yan, and M. U. Rafiq, “Virtual Collection for Distributed Photovoltaic Data: Challenges, Methodologies, and Applications,” 2022. doi:10.3390/en15238783.</w:t>
           </w:r>
           <w:r>
             <w:rPr>
@@ -4653,8 +3874,8 @@
             </w:rPr>
             <w:tab/>
           </w:r>
-          <w:hyperlink r:id="rId26" w:history="1"/>
-          <w:bookmarkEnd w:id="32"/>
+          <w:hyperlink r:id="rId30" w:history="1"/>
+          <w:bookmarkEnd w:id="42"/>
         </w:p>
         <w:p>
           <w:r>
@@ -4673,45 +3894,13 @@
         <w:autoSpaceDN w:val="0"/>
         <w:ind w:hanging="640"/>
       </w:pPr>
-      <w:bookmarkStart w:id="33" w:name="_Ref_src25"/>
+      <w:bookmarkStart w:id="43" w:name="_Ref_src25"/>
       <w:r>
         <w:rPr>
           <w:rFonts w:eastAsia="Times New Roman" w:cs="Times New Roman"/>
           <w:color w:val="000000"/>
         </w:rPr>
-        <w:t>[</w:t>
-      </w:r>
-      <w:proofErr w:type="gramStart"/>
-      <w:r>
-        <w:rPr>
-          <w:rFonts w:eastAsia="Times New Roman" w:cs="Times New Roman"/>
-          <w:color w:val="000000"/>
-        </w:rPr>
-        <w:t>18]T.</w:t>
-      </w:r>
-      <w:proofErr w:type="gramEnd"/>
-      <w:r>
-        <w:rPr>
-          <w:rFonts w:eastAsia="Times New Roman" w:cs="Times New Roman"/>
-          <w:color w:val="000000"/>
-        </w:rPr>
-        <w:t xml:space="preserve"> G. Conley, "GMM estimation with cross sectional dependence," Journal of Econometrics, vol. 92, no. 1, pp. 1-45, Sep. 1999, </w:t>
-      </w:r>
-      <w:proofErr w:type="spellStart"/>
-      <w:r>
-        <w:rPr>
-          <w:rFonts w:eastAsia="Times New Roman" w:cs="Times New Roman"/>
-          <w:color w:val="000000"/>
-        </w:rPr>
-        <w:t>doi</w:t>
-      </w:r>
-      <w:proofErr w:type="spellEnd"/>
-      <w:r>
-        <w:rPr>
-          <w:rFonts w:eastAsia="Times New Roman" w:cs="Times New Roman"/>
-          <w:color w:val="000000"/>
-        </w:rPr>
-        <w:t>: 10.1016/S0304-4076(98)00084-0.</w:t>
+        <w:t>[18]T. G. Conley, "GMM estimation with cross sectional dependence," Journal of Econometrics, vol. 92, no. 1, pp. 1-45, Sep. 1999, doi: 10.1016/S0304-4076(98)00084-0.</w:t>
       </w:r>
       <w:r>
         <w:rPr>
@@ -4720,440 +3909,7 @@
         </w:rPr>
         <w:tab/>
       </w:r>
-      <w:hyperlink r:id="rId27" w:history="1"/>
-      <w:bookmarkEnd w:id="33"/>
-    </w:p>
-    <w:p>
-      <w:pPr>
-        <w:autoSpaceDE w:val="0"/>
-        <w:autoSpaceDN w:val="0"/>
-        <w:ind w:hanging="640"/>
-      </w:pPr>
-      <w:bookmarkStart w:id="34" w:name="_Ref_src26"/>
-      <w:r>
-        <w:rPr>
-          <w:rFonts w:eastAsia="Times New Roman" w:cs="Times New Roman"/>
-          <w:color w:val="000000"/>
-        </w:rPr>
-        <w:t>[</w:t>
-      </w:r>
-      <w:proofErr w:type="gramStart"/>
-      <w:r>
-        <w:rPr>
-          <w:rFonts w:eastAsia="Times New Roman" w:cs="Times New Roman"/>
-          <w:color w:val="000000"/>
-        </w:rPr>
-        <w:t>19]Lawrence</w:t>
-      </w:r>
-      <w:proofErr w:type="gramEnd"/>
-      <w:r>
-        <w:rPr>
-          <w:rFonts w:eastAsia="Times New Roman" w:cs="Times New Roman"/>
-          <w:color w:val="000000"/>
-        </w:rPr>
-        <w:t xml:space="preserve"> Berkeley National Laboratory, "Tracking the Sun: public data file," 2024. [Online]. Available: https://emp.lbl.gov/tracking-the-sun</w:t>
-      </w:r>
-      <w:r>
-        <w:rPr>
-          <w:rFonts w:eastAsia="Times New Roman" w:cs="Times New Roman"/>
-          <w:color w:val="000000"/>
-        </w:rPr>
-        <w:tab/>
-      </w:r>
-      <w:hyperlink r:id="rId28" w:history="1"/>
-      <w:bookmarkEnd w:id="34"/>
-    </w:p>
-    <w:p>
-      <w:pPr>
-        <w:autoSpaceDE w:val="0"/>
-        <w:autoSpaceDN w:val="0"/>
-        <w:ind w:hanging="640"/>
-      </w:pPr>
-      <w:bookmarkStart w:id="35" w:name="_Ref_src27"/>
-      <w:r>
-        <w:rPr>
-          <w:rFonts w:eastAsia="Times New Roman" w:cs="Times New Roman"/>
-          <w:color w:val="000000"/>
-        </w:rPr>
-        <w:t>[</w:t>
-      </w:r>
-      <w:proofErr w:type="gramStart"/>
-      <w:r>
-        <w:rPr>
-          <w:rFonts w:eastAsia="Times New Roman" w:cs="Times New Roman"/>
-          <w:color w:val="000000"/>
-        </w:rPr>
-        <w:t>20]California</w:t>
-      </w:r>
-      <w:proofErr w:type="gramEnd"/>
-      <w:r>
-        <w:rPr>
-          <w:rFonts w:eastAsia="Times New Roman" w:cs="Times New Roman"/>
-          <w:color w:val="000000"/>
-        </w:rPr>
-        <w:t xml:space="preserve"> Distributed Generation Statistics, "Interconnected project sites report, 31 December 2023," 2023. [Online]. Available: https://www.californiadgstats.ca.gov/downloads/</w:t>
-      </w:r>
-      <w:r>
-        <w:rPr>
-          <w:rFonts w:eastAsia="Times New Roman" w:cs="Times New Roman"/>
-          <w:color w:val="000000"/>
-        </w:rPr>
-        <w:tab/>
-      </w:r>
-      <w:hyperlink r:id="rId29" w:history="1"/>
-      <w:bookmarkEnd w:id="35"/>
-    </w:p>
-    <w:p>
-      <w:pPr>
-        <w:autoSpaceDE w:val="0"/>
-        <w:autoSpaceDN w:val="0"/>
-        <w:ind w:hanging="640"/>
-      </w:pPr>
-      <w:bookmarkStart w:id="36" w:name="_Ref_src28"/>
-      <w:r>
-        <w:rPr>
-          <w:rFonts w:eastAsia="Times New Roman" w:cs="Times New Roman"/>
-          <w:color w:val="000000"/>
-        </w:rPr>
-        <w:t>[</w:t>
-      </w:r>
-      <w:proofErr w:type="gramStart"/>
-      <w:r>
-        <w:rPr>
-          <w:rFonts w:eastAsia="Times New Roman" w:cs="Times New Roman"/>
-          <w:color w:val="000000"/>
-        </w:rPr>
-        <w:t>21]California</w:t>
-      </w:r>
-      <w:proofErr w:type="gramEnd"/>
-      <w:r>
-        <w:rPr>
-          <w:rFonts w:eastAsia="Times New Roman" w:cs="Times New Roman"/>
-          <w:color w:val="000000"/>
-        </w:rPr>
-        <w:t xml:space="preserve"> Energy Commission, "California energy storage system survey," 2024. [Online]. Available: https://www.energy.ca.gov/data-reports/energy-almanac/california-electricity-data/california-energy-storage-system-survey</w:t>
-      </w:r>
-      <w:r>
-        <w:rPr>
-          <w:rFonts w:eastAsia="Times New Roman" w:cs="Times New Roman"/>
-          <w:color w:val="000000"/>
-        </w:rPr>
-        <w:tab/>
-      </w:r>
-      <w:hyperlink r:id="rId30" w:history="1"/>
-      <w:bookmarkEnd w:id="36"/>
-    </w:p>
-    <w:p>
-      <w:pPr>
-        <w:autoSpaceDE w:val="0"/>
-        <w:autoSpaceDN w:val="0"/>
-        <w:ind w:hanging="640"/>
-      </w:pPr>
-      <w:bookmarkStart w:id="37" w:name="_Ref_src29"/>
-      <w:r>
-        <w:rPr>
-          <w:rFonts w:eastAsia="Times New Roman" w:cs="Times New Roman"/>
-          <w:color w:val="000000"/>
-        </w:rPr>
-        <w:t>[</w:t>
-      </w:r>
-      <w:proofErr w:type="gramStart"/>
-      <w:r>
-        <w:rPr>
-          <w:rFonts w:eastAsia="Times New Roman" w:cs="Times New Roman"/>
-          <w:color w:val="000000"/>
-        </w:rPr>
-        <w:t>22]California</w:t>
-      </w:r>
-      <w:proofErr w:type="gramEnd"/>
-      <w:r>
-        <w:rPr>
-          <w:rFonts w:eastAsia="Times New Roman" w:cs="Times New Roman"/>
-          <w:color w:val="000000"/>
-        </w:rPr>
-        <w:t xml:space="preserve"> Energy Commission, "Zero emission vehicle and infrastructure statistics," 2024. [Online]. Available: https://www.energy.ca.gov/data-reports/energy-almanac/zero-emission-vehicle-and-infrastructure-statistics-collection/electric</w:t>
-      </w:r>
-      <w:r>
-        <w:rPr>
-          <w:rFonts w:eastAsia="Times New Roman" w:cs="Times New Roman"/>
-          <w:color w:val="000000"/>
-        </w:rPr>
-        <w:tab/>
-      </w:r>
       <w:hyperlink r:id="rId31" w:history="1"/>
-      <w:bookmarkEnd w:id="37"/>
-    </w:p>
-    <w:p>
-      <w:pPr>
-        <w:autoSpaceDE w:val="0"/>
-        <w:autoSpaceDN w:val="0"/>
-        <w:ind w:hanging="640"/>
-      </w:pPr>
-      <w:bookmarkStart w:id="38" w:name="_Ref_src30"/>
-      <w:r>
-        <w:rPr>
-          <w:rFonts w:eastAsia="Times New Roman" w:cs="Times New Roman"/>
-          <w:color w:val="000000"/>
-        </w:rPr>
-        <w:t>[</w:t>
-      </w:r>
-      <w:proofErr w:type="gramStart"/>
-      <w:r>
-        <w:rPr>
-          <w:rFonts w:eastAsia="Times New Roman" w:cs="Times New Roman"/>
-          <w:color w:val="000000"/>
-        </w:rPr>
-        <w:t>23]B.</w:t>
-      </w:r>
-      <w:proofErr w:type="gramEnd"/>
-      <w:r>
-        <w:rPr>
-          <w:rFonts w:eastAsia="Times New Roman" w:cs="Times New Roman"/>
-          <w:color w:val="000000"/>
-        </w:rPr>
-        <w:t xml:space="preserve"> D. Hoen, J. E. </w:t>
-      </w:r>
-      <w:proofErr w:type="spellStart"/>
-      <w:r>
-        <w:rPr>
-          <w:rFonts w:eastAsia="Times New Roman" w:cs="Times New Roman"/>
-          <w:color w:val="000000"/>
-        </w:rPr>
-        <w:t>Diffendorfer</w:t>
-      </w:r>
-      <w:proofErr w:type="spellEnd"/>
-      <w:r>
-        <w:rPr>
-          <w:rFonts w:eastAsia="Times New Roman" w:cs="Times New Roman"/>
-          <w:color w:val="000000"/>
-        </w:rPr>
-        <w:t xml:space="preserve">, J. T. Rand, L. A. Kramer, C. P. Garrity, and H. E. Hunt, "United States wind turbine database," U.S. Geological Survey data release, 2018, </w:t>
-      </w:r>
-      <w:proofErr w:type="spellStart"/>
-      <w:r>
-        <w:rPr>
-          <w:rFonts w:eastAsia="Times New Roman" w:cs="Times New Roman"/>
-          <w:color w:val="000000"/>
-        </w:rPr>
-        <w:t>doi</w:t>
-      </w:r>
-      <w:proofErr w:type="spellEnd"/>
-      <w:r>
-        <w:rPr>
-          <w:rFonts w:eastAsia="Times New Roman" w:cs="Times New Roman"/>
-          <w:color w:val="000000"/>
-        </w:rPr>
-        <w:t>: 10.5066/F7TX3DN0.</w:t>
-      </w:r>
-      <w:r>
-        <w:rPr>
-          <w:rFonts w:eastAsia="Times New Roman" w:cs="Times New Roman"/>
-          <w:color w:val="000000"/>
-        </w:rPr>
-        <w:tab/>
-      </w:r>
-      <w:hyperlink r:id="rId32" w:history="1"/>
-      <w:bookmarkEnd w:id="38"/>
-    </w:p>
-    <w:p>
-      <w:pPr>
-        <w:autoSpaceDE w:val="0"/>
-        <w:autoSpaceDN w:val="0"/>
-        <w:ind w:hanging="640"/>
-      </w:pPr>
-      <w:bookmarkStart w:id="39" w:name="_Ref_src31"/>
-      <w:r>
-        <w:rPr>
-          <w:rFonts w:eastAsia="Times New Roman" w:cs="Times New Roman"/>
-          <w:color w:val="000000"/>
-        </w:rPr>
-        <w:lastRenderedPageBreak/>
-        <w:t>[</w:t>
-      </w:r>
-      <w:proofErr w:type="gramStart"/>
-      <w:r>
-        <w:rPr>
-          <w:rFonts w:eastAsia="Times New Roman" w:cs="Times New Roman"/>
-          <w:color w:val="000000"/>
-        </w:rPr>
-        <w:t>24]U.S.</w:t>
-      </w:r>
-      <w:proofErr w:type="gramEnd"/>
-      <w:r>
-        <w:rPr>
-          <w:rFonts w:eastAsia="Times New Roman" w:cs="Times New Roman"/>
-          <w:color w:val="000000"/>
-        </w:rPr>
-        <w:t xml:space="preserve"> Energy Information Administration, "Power plants," 2023. [Online]. Available: https://atlas.eia.gov/datasets/eia::power-plants/explore</w:t>
-      </w:r>
-      <w:r>
-        <w:rPr>
-          <w:rFonts w:eastAsia="Times New Roman" w:cs="Times New Roman"/>
-          <w:color w:val="000000"/>
-        </w:rPr>
-        <w:tab/>
-      </w:r>
-      <w:hyperlink r:id="rId33" w:history="1"/>
-      <w:bookmarkEnd w:id="39"/>
-    </w:p>
-    <w:p>
-      <w:pPr>
-        <w:autoSpaceDE w:val="0"/>
-        <w:autoSpaceDN w:val="0"/>
-        <w:ind w:hanging="640"/>
-      </w:pPr>
-      <w:bookmarkStart w:id="40" w:name="_Ref_src32"/>
-      <w:r>
-        <w:rPr>
-          <w:rFonts w:eastAsia="Times New Roman" w:cs="Times New Roman"/>
-          <w:color w:val="000000"/>
-        </w:rPr>
-        <w:t>[</w:t>
-      </w:r>
-      <w:proofErr w:type="gramStart"/>
-      <w:r>
-        <w:rPr>
-          <w:rFonts w:eastAsia="Times New Roman" w:cs="Times New Roman"/>
-          <w:color w:val="000000"/>
-        </w:rPr>
-        <w:t>25]U.S.</w:t>
-      </w:r>
-      <w:proofErr w:type="gramEnd"/>
-      <w:r>
-        <w:rPr>
-          <w:rFonts w:eastAsia="Times New Roman" w:cs="Times New Roman"/>
-          <w:color w:val="000000"/>
-        </w:rPr>
-        <w:t xml:space="preserve"> Census Bureau, "American Community Survey 5-year estimates, detailed tables," 2023. [Online]. Available: https://api.census.gov/data/2023/acs/acs5</w:t>
-      </w:r>
-      <w:r>
-        <w:rPr>
-          <w:rFonts w:eastAsia="Times New Roman" w:cs="Times New Roman"/>
-          <w:color w:val="000000"/>
-        </w:rPr>
-        <w:tab/>
-      </w:r>
-      <w:hyperlink r:id="rId34" w:history="1"/>
-      <w:bookmarkEnd w:id="40"/>
-    </w:p>
-    <w:p>
-      <w:pPr>
-        <w:autoSpaceDE w:val="0"/>
-        <w:autoSpaceDN w:val="0"/>
-        <w:ind w:hanging="640"/>
-      </w:pPr>
-      <w:bookmarkStart w:id="41" w:name="_Ref_src33"/>
-      <w:r>
-        <w:rPr>
-          <w:rFonts w:eastAsia="Times New Roman" w:cs="Times New Roman"/>
-          <w:color w:val="000000"/>
-        </w:rPr>
-        <w:t>[</w:t>
-      </w:r>
-      <w:proofErr w:type="gramStart"/>
-      <w:r>
-        <w:rPr>
-          <w:rFonts w:eastAsia="Times New Roman" w:cs="Times New Roman"/>
-          <w:color w:val="000000"/>
-        </w:rPr>
-        <w:t>26]U.S.</w:t>
-      </w:r>
-      <w:proofErr w:type="gramEnd"/>
-      <w:r>
-        <w:rPr>
-          <w:rFonts w:eastAsia="Times New Roman" w:cs="Times New Roman"/>
-          <w:color w:val="000000"/>
-        </w:rPr>
-        <w:t xml:space="preserve"> Census Bureau, "TIGER/Line shapefiles," 2023. [Online]. Available: https://www.census.gov/geographies/mapping-files/time-series/geo/tiger-line-file.html</w:t>
-      </w:r>
-      <w:r>
-        <w:rPr>
-          <w:rFonts w:eastAsia="Times New Roman" w:cs="Times New Roman"/>
-          <w:color w:val="000000"/>
-        </w:rPr>
-        <w:tab/>
-      </w:r>
-      <w:hyperlink r:id="rId35" w:history="1"/>
-      <w:bookmarkEnd w:id="41"/>
-    </w:p>
-    <w:p>
-      <w:pPr>
-        <w:autoSpaceDE w:val="0"/>
-        <w:autoSpaceDN w:val="0"/>
-        <w:ind w:hanging="640"/>
-      </w:pPr>
-      <w:bookmarkStart w:id="42" w:name="_Ref_src34"/>
-      <w:r>
-        <w:rPr>
-          <w:rFonts w:eastAsia="Times New Roman" w:cs="Times New Roman"/>
-          <w:color w:val="000000"/>
-        </w:rPr>
-        <w:t>[</w:t>
-      </w:r>
-      <w:proofErr w:type="gramStart"/>
-      <w:r>
-        <w:rPr>
-          <w:rFonts w:eastAsia="Times New Roman" w:cs="Times New Roman"/>
-          <w:color w:val="000000"/>
-        </w:rPr>
-        <w:t>27]NASA</w:t>
-      </w:r>
-      <w:proofErr w:type="gramEnd"/>
-      <w:r>
-        <w:rPr>
-          <w:rFonts w:eastAsia="Times New Roman" w:cs="Times New Roman"/>
-          <w:color w:val="000000"/>
-        </w:rPr>
-        <w:t xml:space="preserve"> Langley Research Center, "Prediction of Worldwide Energy Resources (POWER)," 2023. [Online]. Available: https://power.larc.nasa.gov/</w:t>
-      </w:r>
-      <w:r>
-        <w:rPr>
-          <w:rFonts w:eastAsia="Times New Roman" w:cs="Times New Roman"/>
-          <w:color w:val="000000"/>
-        </w:rPr>
-        <w:tab/>
-      </w:r>
-      <w:hyperlink r:id="rId36" w:history="1"/>
-      <w:bookmarkEnd w:id="42"/>
-    </w:p>
-    <w:p>
-      <w:pPr>
-        <w:autoSpaceDE w:val="0"/>
-        <w:autoSpaceDN w:val="0"/>
-        <w:ind w:hanging="640"/>
-      </w:pPr>
-      <w:bookmarkStart w:id="43" w:name="_Ref_src35"/>
-      <w:r>
-        <w:rPr>
-          <w:rFonts w:eastAsia="Times New Roman" w:cs="Times New Roman"/>
-          <w:color w:val="000000"/>
-        </w:rPr>
-        <w:t>[</w:t>
-      </w:r>
-      <w:proofErr w:type="gramStart"/>
-      <w:r>
-        <w:rPr>
-          <w:rFonts w:eastAsia="Times New Roman" w:cs="Times New Roman"/>
-          <w:color w:val="000000"/>
-        </w:rPr>
-        <w:t>28]California</w:t>
-      </w:r>
-      <w:proofErr w:type="gramEnd"/>
-      <w:r>
-        <w:rPr>
-          <w:rFonts w:eastAsia="Times New Roman" w:cs="Times New Roman"/>
-          <w:color w:val="000000"/>
-        </w:rPr>
-        <w:t xml:space="preserve"> Energy Commission, "Energy equity indicators: deep dive energy," 2023. [Online]. Available: https://www.energy.ca.gov/data-reports/data-exploration-tools/energy-equity-indicators-dashboard-collection/deep-dive-energy</w:t>
-      </w:r>
-      <w:r>
-        <w:rPr>
-          <w:rFonts w:eastAsia="Times New Roman" w:cs="Times New Roman"/>
-          <w:color w:val="000000"/>
-        </w:rPr>
-        <w:tab/>
-      </w:r>
-      <w:hyperlink r:id="rId37" w:history="1"/>
       <w:bookmarkEnd w:id="43"/>
     </w:p>
     <w:p>
@@ -5162,29 +3918,13 @@
         <w:autoSpaceDN w:val="0"/>
         <w:ind w:hanging="640"/>
       </w:pPr>
-      <w:bookmarkStart w:id="44" w:name="_Ref_src36"/>
+      <w:bookmarkStart w:id="44" w:name="_Ref_src26"/>
       <w:r>
         <w:rPr>
           <w:rFonts w:eastAsia="Times New Roman" w:cs="Times New Roman"/>
           <w:color w:val="000000"/>
         </w:rPr>
-        <w:t>[</w:t>
-      </w:r>
-      <w:proofErr w:type="gramStart"/>
-      <w:r>
-        <w:rPr>
-          <w:rFonts w:eastAsia="Times New Roman" w:cs="Times New Roman"/>
-          <w:color w:val="000000"/>
-        </w:rPr>
-        <w:t>29]Pacific</w:t>
-      </w:r>
-      <w:proofErr w:type="gramEnd"/>
-      <w:r>
-        <w:rPr>
-          <w:rFonts w:eastAsia="Times New Roman" w:cs="Times New Roman"/>
-          <w:color w:val="000000"/>
-        </w:rPr>
-        <w:t xml:space="preserve"> Gas and Electric Company, Southern California Edison, and San Diego Gas and Electric, "Electric usage by ZIP code, 2023 quarterly datasets," 2023. [Online]. Available: https://pge-energydatarequest.com/public_datasets</w:t>
+        <w:t>[19]Lawrence Berkeley National Laboratory, "Tracking the Sun: public data file," 2024. [Online]. Available: https://emp.lbl.gov/tracking-the-sun</w:t>
       </w:r>
       <w:r>
         <w:rPr>
@@ -5193,8 +3933,249 @@
         </w:rPr>
         <w:tab/>
       </w:r>
+      <w:hyperlink r:id="rId32" w:history="1"/>
+      <w:bookmarkEnd w:id="44"/>
+    </w:p>
+    <w:p>
+      <w:pPr>
+        <w:autoSpaceDE w:val="0"/>
+        <w:autoSpaceDN w:val="0"/>
+        <w:ind w:hanging="640"/>
+      </w:pPr>
+      <w:bookmarkStart w:id="45" w:name="_Ref_src27"/>
+      <w:r>
+        <w:rPr>
+          <w:rFonts w:eastAsia="Times New Roman" w:cs="Times New Roman"/>
+          <w:color w:val="000000"/>
+        </w:rPr>
+        <w:t>[20]California Distributed Generation Statistics, "Interconnected project sites report, 31 December 2023," 2023. [Online]. Available: https://www.californiadgstats.ca.gov/downloads/</w:t>
+      </w:r>
+      <w:r>
+        <w:rPr>
+          <w:rFonts w:eastAsia="Times New Roman" w:cs="Times New Roman"/>
+          <w:color w:val="000000"/>
+        </w:rPr>
+        <w:tab/>
+      </w:r>
+      <w:hyperlink r:id="rId33" w:history="1"/>
+      <w:bookmarkEnd w:id="45"/>
+    </w:p>
+    <w:p>
+      <w:pPr>
+        <w:autoSpaceDE w:val="0"/>
+        <w:autoSpaceDN w:val="0"/>
+        <w:ind w:hanging="640"/>
+      </w:pPr>
+      <w:bookmarkStart w:id="46" w:name="_Ref_src28"/>
+      <w:r>
+        <w:rPr>
+          <w:rFonts w:eastAsia="Times New Roman" w:cs="Times New Roman"/>
+          <w:color w:val="000000"/>
+        </w:rPr>
+        <w:t>[21]California Energy Commission, "California energy storage system survey," 2024. [Online]. Available: https://www.energy.ca.gov/data-reports/energy-almanac/california-electricity-data/california-energy-storage-system-survey</w:t>
+      </w:r>
+      <w:r>
+        <w:rPr>
+          <w:rFonts w:eastAsia="Times New Roman" w:cs="Times New Roman"/>
+          <w:color w:val="000000"/>
+        </w:rPr>
+        <w:tab/>
+      </w:r>
+      <w:hyperlink r:id="rId34" w:history="1"/>
+      <w:bookmarkEnd w:id="46"/>
+    </w:p>
+    <w:p>
+      <w:pPr>
+        <w:autoSpaceDE w:val="0"/>
+        <w:autoSpaceDN w:val="0"/>
+        <w:ind w:hanging="640"/>
+      </w:pPr>
+      <w:bookmarkStart w:id="47" w:name="_Ref_src29"/>
+      <w:r>
+        <w:rPr>
+          <w:rFonts w:eastAsia="Times New Roman" w:cs="Times New Roman"/>
+          <w:color w:val="000000"/>
+        </w:rPr>
+        <w:t>[22]California Energy Commission, "Zero emission vehicle and infrastructure statistics," 2024. [Online]. Available: https://www.energy.ca.gov/data-reports/energy-almanac/zero-emission-vehicle-and-infrastructure-statistics-collection/electric</w:t>
+      </w:r>
+      <w:r>
+        <w:rPr>
+          <w:rFonts w:eastAsia="Times New Roman" w:cs="Times New Roman"/>
+          <w:color w:val="000000"/>
+        </w:rPr>
+        <w:tab/>
+      </w:r>
+      <w:hyperlink r:id="rId35" w:history="1"/>
+      <w:bookmarkEnd w:id="47"/>
+    </w:p>
+    <w:p>
+      <w:pPr>
+        <w:autoSpaceDE w:val="0"/>
+        <w:autoSpaceDN w:val="0"/>
+        <w:ind w:hanging="640"/>
+      </w:pPr>
+      <w:bookmarkStart w:id="48" w:name="_Ref_src30"/>
+      <w:r>
+        <w:rPr>
+          <w:rFonts w:eastAsia="Times New Roman" w:cs="Times New Roman"/>
+          <w:color w:val="000000"/>
+        </w:rPr>
+        <w:t>[23]B. D. Hoen, J. E. Diffendorfer, J. T. Rand, L. A. Kramer, C. P. Garrity, and H. E. Hunt, "United States wind turbine database," U.S. Geological Survey data release, 2018, doi: 10.5066/F7TX3DN0.</w:t>
+      </w:r>
+      <w:r>
+        <w:rPr>
+          <w:rFonts w:eastAsia="Times New Roman" w:cs="Times New Roman"/>
+          <w:color w:val="000000"/>
+        </w:rPr>
+        <w:tab/>
+      </w:r>
+      <w:hyperlink r:id="rId36" w:history="1"/>
+      <w:bookmarkEnd w:id="48"/>
+    </w:p>
+    <w:p>
+      <w:pPr>
+        <w:autoSpaceDE w:val="0"/>
+        <w:autoSpaceDN w:val="0"/>
+        <w:ind w:hanging="640"/>
+      </w:pPr>
+      <w:bookmarkStart w:id="49" w:name="_Ref_src31"/>
+      <w:r>
+        <w:rPr>
+          <w:rFonts w:eastAsia="Times New Roman" w:cs="Times New Roman"/>
+          <w:color w:val="000000"/>
+        </w:rPr>
+        <w:lastRenderedPageBreak/>
+        <w:t>[24]U.S. Energy Information Administration, "Power plants," 2023. [Online]. Available: https://atlas.eia.gov/datasets/eia::power-plants/explore</w:t>
+      </w:r>
+      <w:r>
+        <w:rPr>
+          <w:rFonts w:eastAsia="Times New Roman" w:cs="Times New Roman"/>
+          <w:color w:val="000000"/>
+        </w:rPr>
+        <w:tab/>
+      </w:r>
+      <w:hyperlink r:id="rId37" w:history="1"/>
+      <w:bookmarkEnd w:id="49"/>
+    </w:p>
+    <w:p>
+      <w:pPr>
+        <w:autoSpaceDE w:val="0"/>
+        <w:autoSpaceDN w:val="0"/>
+        <w:ind w:hanging="640"/>
+      </w:pPr>
+      <w:bookmarkStart w:id="50" w:name="_Ref_src32"/>
+      <w:r>
+        <w:rPr>
+          <w:rFonts w:eastAsia="Times New Roman" w:cs="Times New Roman"/>
+          <w:color w:val="000000"/>
+        </w:rPr>
+        <w:t>[25]U.S. Census Bureau, "American Community Survey 5-year estimates, detailed tables," 2023. [Online]. Available: https://api.census.gov/data/2023/acs/acs5</w:t>
+      </w:r>
+      <w:r>
+        <w:rPr>
+          <w:rFonts w:eastAsia="Times New Roman" w:cs="Times New Roman"/>
+          <w:color w:val="000000"/>
+        </w:rPr>
+        <w:tab/>
+      </w:r>
       <w:hyperlink r:id="rId38" w:history="1"/>
-      <w:bookmarkEnd w:id="44"/>
+      <w:bookmarkEnd w:id="50"/>
+    </w:p>
+    <w:p>
+      <w:pPr>
+        <w:autoSpaceDE w:val="0"/>
+        <w:autoSpaceDN w:val="0"/>
+        <w:ind w:hanging="640"/>
+      </w:pPr>
+      <w:bookmarkStart w:id="51" w:name="_Ref_src33"/>
+      <w:r>
+        <w:rPr>
+          <w:rFonts w:eastAsia="Times New Roman" w:cs="Times New Roman"/>
+          <w:color w:val="000000"/>
+        </w:rPr>
+        <w:t>[26]U.S. Census Bureau, "TIGER/Line shapefiles," 2023. [Online]. Available: https://www.census.gov/geographies/mapping-files/time-series/geo/tiger-line-file.html</w:t>
+      </w:r>
+      <w:r>
+        <w:rPr>
+          <w:rFonts w:eastAsia="Times New Roman" w:cs="Times New Roman"/>
+          <w:color w:val="000000"/>
+        </w:rPr>
+        <w:tab/>
+      </w:r>
+      <w:hyperlink r:id="rId39" w:history="1"/>
+      <w:bookmarkEnd w:id="51"/>
+    </w:p>
+    <w:p>
+      <w:pPr>
+        <w:autoSpaceDE w:val="0"/>
+        <w:autoSpaceDN w:val="0"/>
+        <w:ind w:hanging="640"/>
+      </w:pPr>
+      <w:bookmarkStart w:id="52" w:name="_Ref_src34"/>
+      <w:r>
+        <w:rPr>
+          <w:rFonts w:eastAsia="Times New Roman" w:cs="Times New Roman"/>
+          <w:color w:val="000000"/>
+        </w:rPr>
+        <w:t>[27]NASA Langley Research Center, "Prediction of Worldwide Energy Resources (POWER)," 2023. [Online]. Available: https://power.larc.nasa.gov/</w:t>
+      </w:r>
+      <w:r>
+        <w:rPr>
+          <w:rFonts w:eastAsia="Times New Roman" w:cs="Times New Roman"/>
+          <w:color w:val="000000"/>
+        </w:rPr>
+        <w:tab/>
+      </w:r>
+      <w:hyperlink r:id="rId40" w:history="1"/>
+      <w:bookmarkEnd w:id="52"/>
+    </w:p>
+    <w:p>
+      <w:pPr>
+        <w:autoSpaceDE w:val="0"/>
+        <w:autoSpaceDN w:val="0"/>
+        <w:ind w:hanging="640"/>
+      </w:pPr>
+      <w:bookmarkStart w:id="53" w:name="_Ref_src35"/>
+      <w:r>
+        <w:rPr>
+          <w:rFonts w:eastAsia="Times New Roman" w:cs="Times New Roman"/>
+          <w:color w:val="000000"/>
+        </w:rPr>
+        <w:t>[28]California Energy Commission, "Energy equity indicators: deep dive energy," 2023. [Online]. Available: https://www.energy.ca.gov/data-reports/data-exploration-tools/energy-equity-indicators-dashboard-collection/deep-dive-energy</w:t>
+      </w:r>
+      <w:r>
+        <w:rPr>
+          <w:rFonts w:eastAsia="Times New Roman" w:cs="Times New Roman"/>
+          <w:color w:val="000000"/>
+        </w:rPr>
+        <w:tab/>
+      </w:r>
+      <w:hyperlink r:id="rId41" w:history="1"/>
+      <w:bookmarkEnd w:id="53"/>
+    </w:p>
+    <w:p>
+      <w:pPr>
+        <w:autoSpaceDE w:val="0"/>
+        <w:autoSpaceDN w:val="0"/>
+        <w:ind w:hanging="640"/>
+      </w:pPr>
+      <w:bookmarkStart w:id="54" w:name="_Ref_src36"/>
+      <w:r>
+        <w:rPr>
+          <w:rFonts w:eastAsia="Times New Roman" w:cs="Times New Roman"/>
+          <w:color w:val="000000"/>
+        </w:rPr>
+        <w:t>[29]Pacific Gas and Electric Company, Southern California Edison, and San Diego Gas and Electric, "Electric usage by ZIP code, 2023 quarterly datasets," 2023. [Online]. Available: https://pge-energydatarequest.com/public_datasets</w:t>
+      </w:r>
+      <w:r>
+        <w:rPr>
+          <w:rFonts w:eastAsia="Times New Roman" w:cs="Times New Roman"/>
+          <w:color w:val="000000"/>
+        </w:rPr>
+        <w:tab/>
+      </w:r>
+      <w:hyperlink r:id="rId42" w:history="1"/>
+      <w:bookmarkEnd w:id="54"/>
     </w:p>
     <w:sectPr>
       <w:pgSz w:w="12240" w:h="15840"/>
@@ -5204,6 +4185,166 @@
     </w:sectPr>
   </w:body>
 </w:document>
+</file>
+
+<file path=word/comments.xml><?xml version="1.0" encoding="utf-8"?>
+<w:comments xmlns:wpc="http://schemas.microsoft.com/office/word/2010/wordprocessingCanvas" xmlns:cx="http://schemas.microsoft.com/office/drawing/2014/chartex" xmlns:cx1="http://schemas.microsoft.com/office/drawing/2015/9/8/chartex" xmlns:cx2="http://schemas.microsoft.com/office/drawing/2015/10/21/chartex" xmlns:cx3="http://schemas.microsoft.com/office/drawing/2016/5/9/chartex" xmlns:cx4="http://schemas.microsoft.com/office/drawing/2016/5/10/chartex" xmlns:cx5="http://schemas.microsoft.com/office/drawing/2016/5/11/chartex" xmlns:cx6="http://schemas.microsoft.com/office/drawing/2016/5/12/chartex" xmlns:cx7="http://schemas.microsoft.com/office/drawing/2016/5/13/chartex" xmlns:cx8="http://schemas.microsoft.com/office/drawing/2016/5/14/chartex" xmlns:mc="http://schemas.openxmlformats.org/markup-compatibility/2006" xmlns:m="http://schemas.openxmlformats.org/officeDocument/2006/math" xmlns:aink="http://schemas.microsoft.com/office/drawing/2016/ink" xmlns:am3d="http://schemas.microsoft.com/office/drawing/2017/model3d" xmlns:oel="http://schemas.microsoft.com/office/2019/extlst" xmlns:r="http://schemas.openxmlformats.org/officeDocument/2006/relationships" xmlns:wp14="http://schemas.microsoft.com/office/word/2010/wordprocessingDrawing" xmlns:wp="http://schemas.openxmlformats.org/drawingml/2006/wordprocessingDrawing" xmlns:wpg="http://schemas.microsoft.com/office/word/2010/wordprocessingGroup" xmlns:wpi="http://schemas.microsoft.com/office/word/2010/wordprocessingInk" xmlns:wps="http://schemas.microsoft.com/office/word/2010/wordprocessingShape" xmlns:o="urn:schemas-microsoft-com:office:office" xmlns:v="urn:schemas-microsoft-com:vml" xmlns:w10="urn:schemas-microsoft-com:office:word" xmlns:w="http://schemas.openxmlformats.org/wordprocessingml/2006/main" xmlns:w14="http://schemas.microsoft.com/office/word/2010/wordml" xmlns:w15="http://schemas.microsoft.com/office/word/2012/wordml" xmlns:w16cex="http://schemas.microsoft.com/office/word/2018/wordml/cex" xmlns:w16cid="http://schemas.microsoft.com/office/word/2016/wordml/cid" xmlns:w16="http://schemas.microsoft.com/office/word/2018/wordml" xmlns:w16sdtdh="http://schemas.microsoft.com/office/word/2020/wordml/sdtdatahash" xmlns:w16sdtfl="http://schemas.microsoft.com/office/word/2024/wordml/sdtformatlock" xmlns:w16se="http://schemas.microsoft.com/office/word/2015/wordml/symex" xmlns:w16du="http://schemas.microsoft.com/office/word/2023/wordml/word16du" xmlns:wne="http://schemas.microsoft.com/office/word/2006/wordml" mc:Ignorable="w14 w15 w16se w16cid w16 w16cex w16sdtdh w16sdtfl w16du wp14">
+  <w:comment w:id="4" w:author="Vineet Jagadeesan Nair" w:date="2026-09-02T15:20:00Z" w:initials="VJN">
+    <w:p>
+      <w:r>
+        <w:rPr>
+          <w:rStyle w:val="CommentReference"/>
+        </w:rPr>
+        <w:annotationRef/>
+      </w:r>
+      <w:r>
+        <w:rPr>
+          <w:sz w:val="20"/>
+          <w:szCs w:val="20"/>
+        </w:rPr>
+        <w:t>Do we need to mark statistical significance of coeffs here too? Regenerate plot to mark significant with solid/filled markers and not with hollow</w:t>
+      </w:r>
+    </w:p>
+  </w:comment>
+  <w:comment w:id="5" w:author="Vineet Jagadeesan Nair" w:date="2026-09-02T15:19:00Z" w:initials="VJN">
+    <w:p>
+      <w:r>
+        <w:rPr>
+          <w:rStyle w:val="CommentReference"/>
+        </w:rPr>
+        <w:annotationRef/>
+      </w:r>
+      <w:r>
+        <w:rPr>
+          <w:sz w:val="20"/>
+          <w:szCs w:val="20"/>
+        </w:rPr>
+        <w:t>but hispanic also crosses zero for solar/storage?</w:t>
+      </w:r>
+    </w:p>
+  </w:comment>
+  <w:comment w:id="6" w:author="Vineet Jagadeesan Nair" w:date="2026-09-02T15:22:00Z" w:initials="VJN">
+    <w:p>
+      <w:r>
+        <w:rPr>
+          <w:rStyle w:val="CommentReference"/>
+        </w:rPr>
+        <w:annotationRef/>
+      </w:r>
+      <w:r>
+        <w:rPr>
+          <w:sz w:val="20"/>
+          <w:szCs w:val="20"/>
+        </w:rPr>
+        <w:t>Need to refer to Fig. 3 too</w:t>
+      </w:r>
+    </w:p>
+  </w:comment>
+  <w:comment w:id="9" w:author="Vineet Jagadeesan Nair" w:date="2026-09-02T15:25:00Z" w:initials="VJN">
+    <w:p>
+      <w:r>
+        <w:rPr>
+          <w:rStyle w:val="CommentReference"/>
+        </w:rPr>
+        <w:annotationRef/>
+      </w:r>
+      <w:r>
+        <w:rPr>
+          <w:sz w:val="20"/>
+          <w:szCs w:val="20"/>
+        </w:rPr>
+        <w:t>Should be referring to Note S4</w:t>
+      </w:r>
+    </w:p>
+  </w:comment>
+  <w:comment w:id="10" w:author="Vineet Jagadeesan Nair" w:date="2026-09-02T15:33:00Z" w:initials="VJN">
+    <w:p>
+      <w:r>
+        <w:rPr>
+          <w:rStyle w:val="CommentReference"/>
+        </w:rPr>
+        <w:annotationRef/>
+      </w:r>
+      <w:r>
+        <w:rPr>
+          <w:sz w:val="20"/>
+          <w:szCs w:val="20"/>
+        </w:rPr>
+        <w:t>reduce unnecessary jargon</w:t>
+      </w:r>
+    </w:p>
+  </w:comment>
+  <w:comment w:id="11" w:author="Vineet Jagadeesan Nair" w:date="2026-09-02T15:33:00Z" w:initials="VJN">
+    <w:p>
+      <w:r>
+        <w:rPr>
+          <w:rStyle w:val="CommentReference"/>
+        </w:rPr>
+        <w:annotationRef/>
+      </w:r>
+      <w:r>
+        <w:rPr>
+          <w:sz w:val="20"/>
+          <w:szCs w:val="20"/>
+        </w:rPr>
+        <w:t>fix</w:t>
+      </w:r>
+    </w:p>
+  </w:comment>
+  <w:comment w:id="12" w:author="Vineet Jagadeesan Nair" w:date="2026-09-02T15:37:00Z" w:initials="VJN">
+    <w:p>
+      <w:r>
+        <w:rPr>
+          <w:rStyle w:val="CommentReference"/>
+        </w:rPr>
+        <w:annotationRef/>
+      </w:r>
+      <w:r>
+        <w:rPr>
+          <w:sz w:val="20"/>
+          <w:szCs w:val="20"/>
+        </w:rPr>
+        <w:t>Refer to supplementary note S2 too</w:t>
+      </w:r>
+    </w:p>
+  </w:comment>
+</w:comments>
+</file>
+
+<file path=word/commentsExtended.xml><?xml version="1.0" encoding="utf-8"?>
+<w15:commentsEx xmlns:wpc="http://schemas.microsoft.com/office/word/2010/wordprocessingCanvas" xmlns:cx="http://schemas.microsoft.com/office/drawing/2014/chartex" xmlns:cx1="http://schemas.microsoft.com/office/drawing/2015/9/8/chartex" xmlns:cx2="http://schemas.microsoft.com/office/drawing/2015/10/21/chartex" xmlns:cx3="http://schemas.microsoft.com/office/drawing/2016/5/9/chartex" xmlns:cx4="http://schemas.microsoft.com/office/drawing/2016/5/10/chartex" xmlns:cx5="http://schemas.microsoft.com/office/drawing/2016/5/11/chartex" xmlns:cx6="http://schemas.microsoft.com/office/drawing/2016/5/12/chartex" xmlns:cx7="http://schemas.microsoft.com/office/drawing/2016/5/13/chartex" xmlns:cx8="http://schemas.microsoft.com/office/drawing/2016/5/14/chartex" xmlns:mc="http://schemas.openxmlformats.org/markup-compatibility/2006" xmlns:m="http://schemas.openxmlformats.org/officeDocument/2006/math" xmlns:aink="http://schemas.microsoft.com/office/drawing/2016/ink" xmlns:am3d="http://schemas.microsoft.com/office/drawing/2017/model3d" xmlns:oel="http://schemas.microsoft.com/office/2019/extlst" xmlns:r="http://schemas.openxmlformats.org/officeDocument/2006/relationships" xmlns:wp14="http://schemas.microsoft.com/office/word/2010/wordprocessingDrawing" xmlns:wp="http://schemas.openxmlformats.org/drawingml/2006/wordprocessingDrawing" xmlns:wpg="http://schemas.microsoft.com/office/word/2010/wordprocessingGroup" xmlns:wpi="http://schemas.microsoft.com/office/word/2010/wordprocessingInk" xmlns:wps="http://schemas.microsoft.com/office/word/2010/wordprocessingShape" xmlns:o="urn:schemas-microsoft-com:office:office" xmlns:v="urn:schemas-microsoft-com:vml" xmlns:w10="urn:schemas-microsoft-com:office:word" xmlns:w="http://schemas.openxmlformats.org/wordprocessingml/2006/main" xmlns:w14="http://schemas.microsoft.com/office/word/2010/wordml" xmlns:w15="http://schemas.microsoft.com/office/word/2012/wordml" xmlns:w16cex="http://schemas.microsoft.com/office/word/2018/wordml/cex" xmlns:w16cid="http://schemas.microsoft.com/office/word/2016/wordml/cid" xmlns:w16="http://schemas.microsoft.com/office/word/2018/wordml" xmlns:w16sdtdh="http://schemas.microsoft.com/office/word/2020/wordml/sdtdatahash" xmlns:w16sdtfl="http://schemas.microsoft.com/office/word/2024/wordml/sdtformatlock" xmlns:w16se="http://schemas.microsoft.com/office/word/2015/wordml/symex" xmlns:w16du="http://schemas.microsoft.com/office/word/2023/wordml/word16du" xmlns:wne="http://schemas.microsoft.com/office/word/2006/wordml" mc:Ignorable="w14 w15 w16se w16cid w16 w16cex w16sdtdh w16sdtfl w16du wp14">
+  <w15:commentEx w15:paraId="45566D52" w15:done="0"/>
+  <w15:commentEx w15:paraId="3513FA01" w15:done="0"/>
+  <w15:commentEx w15:paraId="645FDF5B" w15:done="0"/>
+  <w15:commentEx w15:paraId="0EEFD446" w15:done="0"/>
+  <w15:commentEx w15:paraId="755AE233" w15:done="0"/>
+  <w15:commentEx w15:paraId="5EACDD98" w15:done="0"/>
+  <w15:commentEx w15:paraId="01C845A3" w15:done="0"/>
+</w15:commentsEx>
+</file>
+
+<file path=word/commentsExtensible.xml><?xml version="1.0" encoding="utf-8"?>
+<w16cex:commentsExtensible xmlns:wpc="http://schemas.microsoft.com/office/word/2010/wordprocessingCanvas" xmlns:cx="http://schemas.microsoft.com/office/drawing/2014/chartex" xmlns:cx1="http://schemas.microsoft.com/office/drawing/2015/9/8/chartex" xmlns:cx2="http://schemas.microsoft.com/office/drawing/2015/10/21/chartex" xmlns:cx3="http://schemas.microsoft.com/office/drawing/2016/5/9/chartex" xmlns:cx4="http://schemas.microsoft.com/office/drawing/2016/5/10/chartex" xmlns:cx5="http://schemas.microsoft.com/office/drawing/2016/5/11/chartex" xmlns:cx6="http://schemas.microsoft.com/office/drawing/2016/5/12/chartex" xmlns:cx7="http://schemas.microsoft.com/office/drawing/2016/5/13/chartex" xmlns:cx8="http://schemas.microsoft.com/office/drawing/2016/5/14/chartex" xmlns:cr="http://schemas.microsoft.com/office/comments/2020/reactions" xmlns:mc="http://schemas.openxmlformats.org/markup-compatibility/2006" xmlns:m="http://schemas.openxmlformats.org/officeDocument/2006/math" xmlns:aink="http://schemas.microsoft.com/office/drawing/2016/ink" xmlns:am3d="http://schemas.microsoft.com/office/drawing/2017/model3d" xmlns:oel="http://schemas.microsoft.com/office/2019/extlst" xmlns:r="http://schemas.openxmlformats.org/officeDocument/2006/relationships" xmlns:wp14="http://schemas.microsoft.com/office/word/2010/wordprocessingDrawing" xmlns:wp="http://schemas.openxmlformats.org/drawingml/2006/wordprocessingDrawing" xmlns:wpg="http://schemas.microsoft.com/office/word/2010/wordprocessingGroup" xmlns:wpi="http://schemas.microsoft.com/office/word/2010/wordprocessingInk" xmlns:wps="http://schemas.microsoft.com/office/word/2010/wordprocessingShape" xmlns:o="urn:schemas-microsoft-com:office:office" xmlns:v="urn:schemas-microsoft-com:vml" xmlns:w10="urn:schemas-microsoft-com:office:word" xmlns:w="http://schemas.openxmlformats.org/wordprocessingml/2006/main" xmlns:w14="http://schemas.microsoft.com/office/word/2010/wordml" xmlns:w15="http://schemas.microsoft.com/office/word/2012/wordml" xmlns:w16cex="http://schemas.microsoft.com/office/word/2018/wordml/cex" xmlns:w16cid="http://schemas.microsoft.com/office/word/2016/wordml/cid" xmlns:w16="http://schemas.microsoft.com/office/word/2018/wordml" xmlns:w16sdtdh="http://schemas.microsoft.com/office/word/2020/wordml/sdtdatahash" xmlns:w16sdtfl="http://schemas.microsoft.com/office/word/2024/wordml/sdtformatlock" xmlns:w16se="http://schemas.microsoft.com/office/word/2015/wordml/symex" xmlns:w16du="http://schemas.microsoft.com/office/word/2023/wordml/word16du" xmlns:wne="http://schemas.microsoft.com/office/word/2006/wordml" mc:Ignorable="w14 w15 w16se w16cid w16 w16cex w16sdtdh w16sdtfl cr w16du wp14">
+  <w16cex:commentExtensible w16cex:durableId="06CAA9E9" w16cex:dateUtc="2026-09-02T22:20:00Z"/>
+  <w16cex:commentExtensible w16cex:durableId="206963D5" w16cex:dateUtc="2026-09-02T22:19:00Z"/>
+  <w16cex:commentExtensible w16cex:durableId="2698D22E" w16cex:dateUtc="2026-09-02T22:22:00Z"/>
+  <w16cex:commentExtensible w16cex:durableId="01812446" w16cex:dateUtc="2026-09-02T22:25:00Z"/>
+  <w16cex:commentExtensible w16cex:durableId="5F9988DC" w16cex:dateUtc="2026-09-02T22:33:00Z"/>
+  <w16cex:commentExtensible w16cex:durableId="37A69DE0" w16cex:dateUtc="2026-09-02T22:33:00Z"/>
+  <w16cex:commentExtensible w16cex:durableId="55625292" w16cex:dateUtc="2026-09-02T22:37:00Z"/>
+</w16cex:commentsExtensible>
+</file>
+
+<file path=word/commentsIds.xml><?xml version="1.0" encoding="utf-8"?>
+<w16cid:commentsIds xmlns:wpc="http://schemas.microsoft.com/office/word/2010/wordprocessingCanvas" xmlns:cx="http://schemas.microsoft.com/office/drawing/2014/chartex" xmlns:cx1="http://schemas.microsoft.com/office/drawing/2015/9/8/chartex" xmlns:cx2="http://schemas.microsoft.com/office/drawing/2015/10/21/chartex" xmlns:cx3="http://schemas.microsoft.com/office/drawing/2016/5/9/chartex" xmlns:cx4="http://schemas.microsoft.com/office/drawing/2016/5/10/chartex" xmlns:cx5="http://schemas.microsoft.com/office/drawing/2016/5/11/chartex" xmlns:cx6="http://schemas.microsoft.com/office/drawing/2016/5/12/chartex" xmlns:cx7="http://schemas.microsoft.com/office/drawing/2016/5/13/chartex" xmlns:cx8="http://schemas.microsoft.com/office/drawing/2016/5/14/chartex" xmlns:mc="http://schemas.openxmlformats.org/markup-compatibility/2006" xmlns:m="http://schemas.openxmlformats.org/officeDocument/2006/math" xmlns:aink="http://schemas.microsoft.com/office/drawing/2016/ink" xmlns:am3d="http://schemas.microsoft.com/office/drawing/2017/model3d" xmlns:oel="http://schemas.microsoft.com/office/2019/extlst" xmlns:r="http://schemas.openxmlformats.org/officeDocument/2006/relationships" xmlns:wp14="http://schemas.microsoft.com/office/word/2010/wordprocessingDrawing" xmlns:wp="http://schemas.openxmlformats.org/drawingml/2006/wordprocessingDrawing" xmlns:wpg="http://schemas.microsoft.com/office/word/2010/wordprocessingGroup" xmlns:wpi="http://schemas.microsoft.com/office/word/2010/wordprocessingInk" xmlns:wps="http://schemas.microsoft.com/office/word/2010/wordprocessingShape" xmlns:o="urn:schemas-microsoft-com:office:office" xmlns:v="urn:schemas-microsoft-com:vml" xmlns:w10="urn:schemas-microsoft-com:office:word" xmlns:w="http://schemas.openxmlformats.org/wordprocessingml/2006/main" xmlns:w14="http://schemas.microsoft.com/office/word/2010/wordml" xmlns:w15="http://schemas.microsoft.com/office/word/2012/wordml" xmlns:w16cex="http://schemas.microsoft.com/office/word/2018/wordml/cex" xmlns:w16cid="http://schemas.microsoft.com/office/word/2016/wordml/cid" xmlns:w16="http://schemas.microsoft.com/office/word/2018/wordml" xmlns:w16sdtdh="http://schemas.microsoft.com/office/word/2020/wordml/sdtdatahash" xmlns:w16sdtfl="http://schemas.microsoft.com/office/word/2024/wordml/sdtformatlock" xmlns:w16se="http://schemas.microsoft.com/office/word/2015/wordml/symex" xmlns:w16du="http://schemas.microsoft.com/office/word/2023/wordml/word16du" xmlns:wne="http://schemas.microsoft.com/office/word/2006/wordml" mc:Ignorable="w14 w15 w16se w16cid w16 w16cex w16sdtdh w16sdtfl w16du wp14">
+  <w16cid:commentId w16cid:paraId="45566D52" w16cid:durableId="06CAA9E9"/>
+  <w16cid:commentId w16cid:paraId="3513FA01" w16cid:durableId="206963D5"/>
+  <w16cid:commentId w16cid:paraId="645FDF5B" w16cid:durableId="2698D22E"/>
+  <w16cid:commentId w16cid:paraId="0EEFD446" w16cid:durableId="01812446"/>
+  <w16cid:commentId w16cid:paraId="755AE233" w16cid:durableId="5F9988DC"/>
+  <w16cid:commentId w16cid:paraId="5EACDD98" w16cid:durableId="37A69DE0"/>
+  <w16cid:commentId w16cid:paraId="01C845A3" w16cid:durableId="55625292"/>
+</w16cid:commentsIds>
 </file>
 
 <file path=word/numbering.xml><?xml version="1.0" encoding="utf-8"?>
@@ -5624,6 +4765,14 @@
     <w:abstractNumId w:val="9"/>
   </w:num>
 </w:numbering>
+</file>
+
+<file path=word/people.xml><?xml version="1.0" encoding="utf-8"?>
+<w15:people xmlns:wpc="http://schemas.microsoft.com/office/word/2010/wordprocessingCanvas" xmlns:cx="http://schemas.microsoft.com/office/drawing/2014/chartex" xmlns:cx1="http://schemas.microsoft.com/office/drawing/2015/9/8/chartex" xmlns:cx2="http://schemas.microsoft.com/office/drawing/2015/10/21/chartex" xmlns:cx3="http://schemas.microsoft.com/office/drawing/2016/5/9/chartex" xmlns:cx4="http://schemas.microsoft.com/office/drawing/2016/5/10/chartex" xmlns:cx5="http://schemas.microsoft.com/office/drawing/2016/5/11/chartex" xmlns:cx6="http://schemas.microsoft.com/office/drawing/2016/5/12/chartex" xmlns:cx7="http://schemas.microsoft.com/office/drawing/2016/5/13/chartex" xmlns:cx8="http://schemas.microsoft.com/office/drawing/2016/5/14/chartex" xmlns:mc="http://schemas.openxmlformats.org/markup-compatibility/2006" xmlns:m="http://schemas.openxmlformats.org/officeDocument/2006/math" xmlns:aink="http://schemas.microsoft.com/office/drawing/2016/ink" xmlns:am3d="http://schemas.microsoft.com/office/drawing/2017/model3d" xmlns:oel="http://schemas.microsoft.com/office/2019/extlst" xmlns:r="http://schemas.openxmlformats.org/officeDocument/2006/relationships" xmlns:wp14="http://schemas.microsoft.com/office/word/2010/wordprocessingDrawing" xmlns:wp="http://schemas.openxmlformats.org/drawingml/2006/wordprocessingDrawing" xmlns:wpg="http://schemas.microsoft.com/office/word/2010/wordprocessingGroup" xmlns:wpi="http://schemas.microsoft.com/office/word/2010/wordprocessingInk" xmlns:wps="http://schemas.microsoft.com/office/word/2010/wordprocessingShape" xmlns:o="urn:schemas-microsoft-com:office:office" xmlns:v="urn:schemas-microsoft-com:vml" xmlns:w10="urn:schemas-microsoft-com:office:word" xmlns:w="http://schemas.openxmlformats.org/wordprocessingml/2006/main" xmlns:w14="http://schemas.microsoft.com/office/word/2010/wordml" xmlns:w15="http://schemas.microsoft.com/office/word/2012/wordml" xmlns:w16cex="http://schemas.microsoft.com/office/word/2018/wordml/cex" xmlns:w16cid="http://schemas.microsoft.com/office/word/2016/wordml/cid" xmlns:w16="http://schemas.microsoft.com/office/word/2018/wordml" xmlns:w16sdtdh="http://schemas.microsoft.com/office/word/2020/wordml/sdtdatahash" xmlns:w16sdtfl="http://schemas.microsoft.com/office/word/2024/wordml/sdtformatlock" xmlns:w16se="http://schemas.microsoft.com/office/word/2015/wordml/symex" xmlns:w16du="http://schemas.microsoft.com/office/word/2023/wordml/word16du" xmlns:wne="http://schemas.microsoft.com/office/word/2006/wordml" mc:Ignorable="w14 w15 w16se w16cid w16 w16cex w16sdtdh w16sdtfl w16du wp14">
+  <w15:person w15:author="Vineet Jagadeesan Nair">
+    <w15:presenceInfo w15:providerId="AD" w15:userId="S::jvineet9@mit.edu::f89f4b57-9500-4ce3-a8ff-e7c26d7f1e7b"/>
+  </w15:person>
+</w15:people>
 </file>
 
 <file path=word/styles.xml><?xml version="1.0" encoding="utf-8"?>

</xml_diff>